<commit_message>
refactor(api-test): update docs and reflection route
</commit_message>
<xml_diff>
--- a/API Docs/API Docs.docx
+++ b/API Docs/API Docs.docx
@@ -20126,7 +20126,7 @@
       <w:pPr>
         <w:spacing w:after="0"/>
         <w:rPr>
-          <w:rFonts w:ascii="TH SarabunPSK" w:hAnsi="TH SarabunPSK" w:cs="TH SarabunPSK" w:hint="cs"/>
+          <w:rFonts w:ascii="TH SarabunPSK" w:hAnsi="TH SarabunPSK" w:cs="TH SarabunPSK"/>
           <w:b/>
           <w:bCs/>
           <w:sz w:val="36"/>
@@ -21553,14 +21553,27 @@
           <w:szCs w:val="32"/>
         </w:rPr>
       </w:pPr>
-      <w:r>
-        <w:rPr>
-          <w:rFonts w:ascii="TH SarabunPSK" w:hAnsi="TH SarabunPSK" w:cs="TH SarabunPSK"/>
-          <w:b/>
-          <w:bCs/>
-          <w:sz w:val="32"/>
-          <w:szCs w:val="32"/>
-        </w:rPr>
+    </w:p>
+    <w:p>
+      <w:pPr>
+        <w:spacing w:after="0"/>
+        <w:rPr>
+          <w:rFonts w:ascii="TH SarabunPSK" w:hAnsi="TH SarabunPSK" w:cs="TH SarabunPSK"/>
+          <w:b/>
+          <w:bCs/>
+          <w:sz w:val="32"/>
+          <w:szCs w:val="32"/>
+        </w:rPr>
+      </w:pPr>
+      <w:r>
+        <w:rPr>
+          <w:rFonts w:ascii="TH SarabunPSK" w:hAnsi="TH SarabunPSK" w:cs="TH SarabunPSK"/>
+          <w:b/>
+          <w:bCs/>
+          <w:sz w:val="32"/>
+          <w:szCs w:val="32"/>
+        </w:rPr>
+        <w:lastRenderedPageBreak/>
         <w:t xml:space="preserve">Initialize </w:t>
       </w:r>
       <w:r>
@@ -21596,7 +21609,6 @@
           <w:sz w:val="32"/>
           <w:szCs w:val="32"/>
         </w:rPr>
-        <w:lastRenderedPageBreak/>
         <w:t>Port :</w:t>
       </w:r>
       <w:proofErr w:type="gramEnd"/>
@@ -22969,6 +22981,7 @@
           <w:sz w:val="32"/>
           <w:szCs w:val="32"/>
         </w:rPr>
+        <w:lastRenderedPageBreak/>
         <w:t xml:space="preserve">Response (200 OK): </w:t>
       </w:r>
     </w:p>
@@ -22990,7 +23003,6 @@
         <w:rPr>
           <w:noProof/>
         </w:rPr>
-        <w:lastRenderedPageBreak/>
         <mc:AlternateContent>
           <mc:Choice Requires="wps">
             <w:drawing>
@@ -24379,6 +24391,7 @@
           <w:sz w:val="32"/>
           <w:szCs w:val="32"/>
         </w:rPr>
+        <w:lastRenderedPageBreak/>
         <w:t xml:space="preserve">Response (200 OK): </w:t>
       </w:r>
     </w:p>
@@ -24400,7 +24413,6 @@
         <w:rPr>
           <w:noProof/>
         </w:rPr>
-        <w:lastRenderedPageBreak/>
         <mc:AlternateContent>
           <mc:Choice Requires="wps">
             <w:drawing>
@@ -25679,19 +25691,8 @@
     <w:p>
       <w:pPr>
         <w:spacing w:after="0"/>
-        <w:ind w:left="360"/>
-        <w:rPr>
-          <w:rFonts w:ascii="TH SarabunPSK" w:hAnsi="TH SarabunPSK" w:cs="TH SarabunPSK"/>
-          <w:sz w:val="36"/>
-          <w:szCs w:val="36"/>
-        </w:rPr>
-      </w:pPr>
-    </w:p>
-    <w:p>
-      <w:pPr>
-        <w:spacing w:after="0"/>
-        <w:rPr>
-          <w:rFonts w:ascii="TH SarabunPSK" w:hAnsi="TH SarabunPSK" w:cs="TH SarabunPSK"/>
+        <w:rPr>
+          <w:rFonts w:ascii="TH SarabunPSK" w:hAnsi="TH SarabunPSK" w:cs="TH SarabunPSK" w:hint="cs"/>
           <w:sz w:val="32"/>
           <w:szCs w:val="32"/>
         </w:rPr>
@@ -26496,33 +26497,46 @@
       <w:pPr>
         <w:spacing w:after="0"/>
         <w:rPr>
-          <w:rFonts w:ascii="TH SarabunPSK" w:hAnsi="TH SarabunPSK" w:cs="TH SarabunPSK"/>
-          <w:b/>
-          <w:bCs/>
-          <w:sz w:val="32"/>
-          <w:szCs w:val="32"/>
-        </w:rPr>
-      </w:pPr>
-    </w:p>
-    <w:p>
-      <w:pPr>
-        <w:spacing w:after="0"/>
-        <w:rPr>
-          <w:rFonts w:ascii="TH SarabunPSK" w:hAnsi="TH SarabunPSK" w:cs="TH SarabunPSK"/>
-          <w:b/>
-          <w:bCs/>
-          <w:sz w:val="32"/>
-          <w:szCs w:val="32"/>
-        </w:rPr>
-      </w:pPr>
-      <w:r>
-        <w:rPr>
-          <w:rFonts w:ascii="TH SarabunPSK" w:hAnsi="TH SarabunPSK" w:cs="TH SarabunPSK"/>
-          <w:b/>
-          <w:bCs/>
-          <w:sz w:val="32"/>
-          <w:szCs w:val="32"/>
-        </w:rPr>
+          <w:rFonts w:ascii="TH SarabunPSK" w:hAnsi="TH SarabunPSK" w:cs="TH SarabunPSK" w:hint="cs"/>
+          <w:b/>
+          <w:bCs/>
+          <w:sz w:val="32"/>
+          <w:szCs w:val="32"/>
+        </w:rPr>
+      </w:pPr>
+    </w:p>
+    <w:p>
+      <w:pPr>
+        <w:spacing w:after="0"/>
+        <w:rPr>
+          <w:rFonts w:ascii="TH SarabunPSK" w:hAnsi="TH SarabunPSK" w:cs="TH SarabunPSK"/>
+          <w:b/>
+          <w:bCs/>
+          <w:sz w:val="32"/>
+          <w:szCs w:val="32"/>
+        </w:rPr>
+      </w:pPr>
+    </w:p>
+    <w:p>
+      <w:pPr>
+        <w:spacing w:after="0"/>
+        <w:rPr>
+          <w:rFonts w:ascii="TH SarabunPSK" w:hAnsi="TH SarabunPSK" w:cs="TH SarabunPSK"/>
+          <w:b/>
+          <w:bCs/>
+          <w:sz w:val="32"/>
+          <w:szCs w:val="32"/>
+        </w:rPr>
+      </w:pPr>
+      <w:r>
+        <w:rPr>
+          <w:rFonts w:ascii="TH SarabunPSK" w:hAnsi="TH SarabunPSK" w:cs="TH SarabunPSK"/>
+          <w:b/>
+          <w:bCs/>
+          <w:sz w:val="32"/>
+          <w:szCs w:val="32"/>
+        </w:rPr>
+        <w:lastRenderedPageBreak/>
         <w:t xml:space="preserve">Search </w:t>
       </w:r>
       <w:r>
@@ -26568,7 +26582,6 @@
           <w:sz w:val="32"/>
           <w:szCs w:val="32"/>
         </w:rPr>
-        <w:lastRenderedPageBreak/>
         <w:t>Port :</w:t>
       </w:r>
       <w:proofErr w:type="gramEnd"/>
@@ -28201,6 +28214,7 @@
           <w:sz w:val="32"/>
           <w:szCs w:val="32"/>
         </w:rPr>
+        <w:lastRenderedPageBreak/>
         <w:t>Delete Learning Path</w:t>
       </w:r>
     </w:p>
@@ -28222,7 +28236,6 @@
           <w:sz w:val="32"/>
           <w:szCs w:val="32"/>
         </w:rPr>
-        <w:lastRenderedPageBreak/>
         <w:t>Port :</w:t>
       </w:r>
       <w:proofErr w:type="gramEnd"/>
@@ -28910,9 +28923,10 @@
       <w:pPr>
         <w:spacing w:after="0"/>
         <w:rPr>
-          <w:rFonts w:ascii="TH SarabunPSK" w:hAnsi="TH SarabunPSK" w:cs="TH SarabunPSK"/>
-          <w:sz w:val="32"/>
-          <w:szCs w:val="32"/>
+          <w:rFonts w:ascii="TH SarabunPSK" w:hAnsi="TH SarabunPSK" w:cs="TH SarabunPSK" w:hint="cs"/>
+          <w:sz w:val="32"/>
+          <w:szCs w:val="32"/>
+          <w:cs/>
         </w:rPr>
       </w:pPr>
       <w:proofErr w:type="gramStart"/>
@@ -29996,6 +30010,7 @@
           <w:sz w:val="36"/>
           <w:szCs w:val="36"/>
         </w:rPr>
+        <w:lastRenderedPageBreak/>
         <w:t>Reflection</w:t>
       </w:r>
       <w:r>
@@ -30028,7 +30043,6 @@
           <w:sz w:val="32"/>
           <w:szCs w:val="32"/>
         </w:rPr>
-        <w:lastRenderedPageBreak/>
         <w:t>All</w:t>
       </w:r>
       <w:r>
@@ -30425,7 +30439,10 @@
                               <w:spacing w:after="0"/>
                             </w:pPr>
                             <w:r>
-                              <w:t xml:space="preserve">    {</w:t>
+                              <w:t xml:space="preserve">    </w:t>
+                            </w:r>
+                            <w:r>
+                              <w:t>{</w:t>
                             </w:r>
                           </w:p>
                           <w:p>
@@ -30446,15 +30463,7 @@
                             </w:r>
                             <w:proofErr w:type="spellEnd"/>
                             <w:r>
-                              <w:t>": "</w:t>
-                            </w:r>
-                            <w:proofErr w:type="spellStart"/>
-                            <w:r>
-                              <w:t>uuid</w:t>
-                            </w:r>
-                            <w:proofErr w:type="spellEnd"/>
-                            <w:r>
-                              <w:t>",</w:t>
+                              <w:t>": "3A90BDE9-1DCC-402E-B863-B3DBF027DBBB",</w:t>
                             </w:r>
                           </w:p>
                           <w:p>
@@ -30475,7 +30484,7 @@
                             </w:r>
                             <w:proofErr w:type="spellEnd"/>
                             <w:r>
-                              <w:t>": "string",</w:t>
+                              <w:t>": "8",</w:t>
                             </w:r>
                           </w:p>
                           <w:p>
@@ -30496,31 +30505,31 @@
                             </w:r>
                             <w:proofErr w:type="spellEnd"/>
                             <w:r>
-                              <w:t>": "string",</w:t>
-                            </w:r>
-                          </w:p>
-                          <w:p>
-                            <w:pPr>
-                              <w:spacing w:after="0"/>
-                            </w:pPr>
-                            <w:r>
-                              <w:t xml:space="preserve">      "reflect": "string",</w:t>
-                            </w:r>
-                          </w:p>
-                          <w:p>
-                            <w:pPr>
-                              <w:spacing w:after="0"/>
-                            </w:pPr>
-                            <w:r>
-                              <w:t xml:space="preserve">      "mood": "string",</w:t>
-                            </w:r>
-                          </w:p>
-                          <w:p>
-                            <w:pPr>
-                              <w:spacing w:after="0"/>
-                            </w:pPr>
-                            <w:r>
-                              <w:t xml:space="preserve">      "tag": "string",</w:t>
+                              <w:t>": "Test learning",</w:t>
+                            </w:r>
+                          </w:p>
+                          <w:p>
+                            <w:pPr>
+                              <w:spacing w:after="0"/>
+                            </w:pPr>
+                            <w:r>
+                              <w:t xml:space="preserve">      "reflect": "Test reflection",</w:t>
+                            </w:r>
+                          </w:p>
+                          <w:p>
+                            <w:pPr>
+                              <w:spacing w:after="0"/>
+                            </w:pPr>
+                            <w:r>
+                              <w:t xml:space="preserve">      "mood": "",</w:t>
+                            </w:r>
+                          </w:p>
+                          <w:p>
+                            <w:pPr>
+                              <w:spacing w:after="0"/>
+                            </w:pPr>
+                            <w:r>
+                              <w:t xml:space="preserve">      "tag": "",</w:t>
                             </w:r>
                           </w:p>
                           <w:p>
@@ -30541,7 +30550,7 @@
                             </w:r>
                             <w:proofErr w:type="spellEnd"/>
                             <w:r>
-                              <w:t>": "string",</w:t>
+                              <w:t>": "7",</w:t>
                             </w:r>
                           </w:p>
                           <w:p>
@@ -30562,7 +30571,7 @@
                             </w:r>
                             <w:proofErr w:type="spellEnd"/>
                             <w:r>
-                              <w:t>": "string",</w:t>
+                              <w:t>": "3",</w:t>
                             </w:r>
                           </w:p>
                           <w:p>
@@ -30583,7 +30592,7 @@
                             </w:r>
                             <w:proofErr w:type="spellEnd"/>
                             <w:r>
-                              <w:t>": "2026-01-07T10:30:00Z",</w:t>
+                              <w:t>": "2026-01-18T06:29:08.79Z",</w:t>
                             </w:r>
                           </w:p>
                           <w:p>
@@ -30604,15 +30613,7 @@
                             </w:r>
                             <w:proofErr w:type="spellEnd"/>
                             <w:r>
-                              <w:t>": "</w:t>
-                            </w:r>
-                            <w:proofErr w:type="spellStart"/>
-                            <w:r>
-                              <w:t>uuid</w:t>
-                            </w:r>
-                            <w:proofErr w:type="spellEnd"/>
-                            <w:r>
-                              <w:t>"</w:t>
+                              <w:t>": "11111111-2222-3333-4444-555555555555"</w:t>
                             </w:r>
                           </w:p>
                           <w:p>
@@ -30698,7 +30699,10 @@
                         <w:spacing w:after="0"/>
                       </w:pPr>
                       <w:r>
-                        <w:t xml:space="preserve">    {</w:t>
+                        <w:t xml:space="preserve">    </w:t>
+                      </w:r>
+                      <w:r>
+                        <w:t>{</w:t>
                       </w:r>
                     </w:p>
                     <w:p>
@@ -30719,15 +30723,7 @@
                       </w:r>
                       <w:proofErr w:type="spellEnd"/>
                       <w:r>
-                        <w:t>": "</w:t>
-                      </w:r>
-                      <w:proofErr w:type="spellStart"/>
-                      <w:r>
-                        <w:t>uuid</w:t>
-                      </w:r>
-                      <w:proofErr w:type="spellEnd"/>
-                      <w:r>
-                        <w:t>",</w:t>
+                        <w:t>": "3A90BDE9-1DCC-402E-B863-B3DBF027DBBB",</w:t>
                       </w:r>
                     </w:p>
                     <w:p>
@@ -30748,7 +30744,7 @@
                       </w:r>
                       <w:proofErr w:type="spellEnd"/>
                       <w:r>
-                        <w:t>": "string",</w:t>
+                        <w:t>": "8",</w:t>
                       </w:r>
                     </w:p>
                     <w:p>
@@ -30769,31 +30765,31 @@
                       </w:r>
                       <w:proofErr w:type="spellEnd"/>
                       <w:r>
-                        <w:t>": "string",</w:t>
-                      </w:r>
-                    </w:p>
-                    <w:p>
-                      <w:pPr>
-                        <w:spacing w:after="0"/>
-                      </w:pPr>
-                      <w:r>
-                        <w:t xml:space="preserve">      "reflect": "string",</w:t>
-                      </w:r>
-                    </w:p>
-                    <w:p>
-                      <w:pPr>
-                        <w:spacing w:after="0"/>
-                      </w:pPr>
-                      <w:r>
-                        <w:t xml:space="preserve">      "mood": "string",</w:t>
-                      </w:r>
-                    </w:p>
-                    <w:p>
-                      <w:pPr>
-                        <w:spacing w:after="0"/>
-                      </w:pPr>
-                      <w:r>
-                        <w:t xml:space="preserve">      "tag": "string",</w:t>
+                        <w:t>": "Test learning",</w:t>
+                      </w:r>
+                    </w:p>
+                    <w:p>
+                      <w:pPr>
+                        <w:spacing w:after="0"/>
+                      </w:pPr>
+                      <w:r>
+                        <w:t xml:space="preserve">      "reflect": "Test reflection",</w:t>
+                      </w:r>
+                    </w:p>
+                    <w:p>
+                      <w:pPr>
+                        <w:spacing w:after="0"/>
+                      </w:pPr>
+                      <w:r>
+                        <w:t xml:space="preserve">      "mood": "",</w:t>
+                      </w:r>
+                    </w:p>
+                    <w:p>
+                      <w:pPr>
+                        <w:spacing w:after="0"/>
+                      </w:pPr>
+                      <w:r>
+                        <w:t xml:space="preserve">      "tag": "",</w:t>
                       </w:r>
                     </w:p>
                     <w:p>
@@ -30814,7 +30810,7 @@
                       </w:r>
                       <w:proofErr w:type="spellEnd"/>
                       <w:r>
-                        <w:t>": "string",</w:t>
+                        <w:t>": "7",</w:t>
                       </w:r>
                     </w:p>
                     <w:p>
@@ -30835,7 +30831,7 @@
                       </w:r>
                       <w:proofErr w:type="spellEnd"/>
                       <w:r>
-                        <w:t>": "string",</w:t>
+                        <w:t>": "3",</w:t>
                       </w:r>
                     </w:p>
                     <w:p>
@@ -30856,7 +30852,7 @@
                       </w:r>
                       <w:proofErr w:type="spellEnd"/>
                       <w:r>
-                        <w:t>": "2026-01-07T10:30:00Z",</w:t>
+                        <w:t>": "2026-01-18T06:29:08.79Z",</w:t>
                       </w:r>
                     </w:p>
                     <w:p>
@@ -30877,15 +30873,7 @@
                       </w:r>
                       <w:proofErr w:type="spellEnd"/>
                       <w:r>
-                        <w:t>": "</w:t>
-                      </w:r>
-                      <w:proofErr w:type="spellStart"/>
-                      <w:r>
-                        <w:t>uuid</w:t>
-                      </w:r>
-                      <w:proofErr w:type="spellEnd"/>
-                      <w:r>
-                        <w:t>"</w:t>
+                        <w:t>": "11111111-2222-3333-4444-555555555555"</w:t>
                       </w:r>
                     </w:p>
                     <w:p>
@@ -31132,6 +31120,7 @@
           <w:sz w:val="32"/>
           <w:szCs w:val="32"/>
         </w:rPr>
+        <w:lastRenderedPageBreak/>
         <w:t>Reflection by ID</w:t>
       </w:r>
     </w:p>
@@ -31153,7 +31142,6 @@
           <w:sz w:val="32"/>
           <w:szCs w:val="32"/>
         </w:rPr>
-        <w:lastRenderedPageBreak/>
         <w:t>Port :</w:t>
       </w:r>
       <w:proofErr w:type="gramEnd"/>
@@ -31380,7 +31368,7 @@
         <mc:AlternateContent>
           <mc:Choice Requires="wps">
             <w:drawing>
-              <wp:anchor distT="0" distB="0" distL="114300" distR="114300" simplePos="0" relativeHeight="251805696" behindDoc="0" locked="0" layoutInCell="1" allowOverlap="1" wp14:anchorId="11B9022A" wp14:editId="343229A5">
+              <wp:anchor distT="0" distB="0" distL="114300" distR="114300" simplePos="0" relativeHeight="251805696" behindDoc="0" locked="0" layoutInCell="1" allowOverlap="1" wp14:anchorId="11B9022A" wp14:editId="6F5F4217">
                 <wp:simplePos x="0" y="0"/>
                 <wp:positionH relativeFrom="margin">
                   <wp:align>right</wp:align>
@@ -31388,8 +31376,8 @@
                 <wp:positionV relativeFrom="paragraph">
                   <wp:posOffset>27940</wp:posOffset>
                 </wp:positionV>
-                <wp:extent cx="5925820" cy="3180273"/>
-                <wp:effectExtent l="0" t="0" r="17780" b="20320"/>
+                <wp:extent cx="5925820" cy="3395207"/>
+                <wp:effectExtent l="0" t="0" r="17780" b="15240"/>
                 <wp:wrapNone/>
                 <wp:docPr id="145073968" name="Rectangle 2"/>
                 <wp:cNvGraphicFramePr>
@@ -31404,7 +31392,7 @@
                       <wps:spPr bwMode="auto">
                         <a:xfrm>
                           <a:off x="0" y="0"/>
-                          <a:ext cx="5925820" cy="3180273"/>
+                          <a:ext cx="5925820" cy="3395207"/>
                         </a:xfrm>
                         <a:prstGeom prst="rect">
                           <a:avLst/>
@@ -31441,7 +31429,7 @@
           </mc:Choice>
           <mc:Fallback>
             <w:pict>
-              <v:rect w14:anchorId="1F28C615" id="Rectangle 2" o:spid="_x0000_s1026" style="position:absolute;margin-left:415.4pt;margin-top:2.2pt;width:466.6pt;height:250.4pt;z-index:251805696;visibility:visible;mso-wrap-style:square;mso-width-percent:0;mso-height-percent:0;mso-wrap-distance-left:9pt;mso-wrap-distance-top:0;mso-wrap-distance-right:9pt;mso-wrap-distance-bottom:0;mso-position-horizontal:right;mso-position-horizontal-relative:margin;mso-position-vertical:absolute;mso-position-vertical-relative:text;mso-width-percent:0;mso-height-percent:0;mso-width-relative:page;mso-height-relative:page;v-text-anchor:top" o:gfxdata="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" fillcolor="#d8d8d8 [2732]">
+              <v:rect w14:anchorId="063E0FC5" id="Rectangle 2" o:spid="_x0000_s1026" style="position:absolute;margin-left:415.4pt;margin-top:2.2pt;width:466.6pt;height:267.35pt;z-index:251805696;visibility:visible;mso-wrap-style:square;mso-width-percent:0;mso-height-percent:0;mso-wrap-distance-left:9pt;mso-wrap-distance-top:0;mso-wrap-distance-right:9pt;mso-wrap-distance-bottom:0;mso-position-horizontal:right;mso-position-horizontal-relative:margin;mso-position-vertical:absolute;mso-position-vertical-relative:text;mso-width-percent:0;mso-height-percent:0;mso-width-relative:page;mso-height-relative:page;v-text-anchor:top" o:gfxdata="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" fillcolor="#d8d8d8 [2732]">
                 <w10:wrap anchorx="margin"/>
               </v:rect>
             </w:pict>
@@ -31455,15 +31443,15 @@
         <mc:AlternateContent>
           <mc:Choice Requires="wps">
             <w:drawing>
-              <wp:anchor distT="0" distB="0" distL="114300" distR="114300" simplePos="0" relativeHeight="251806720" behindDoc="0" locked="0" layoutInCell="1" allowOverlap="1" wp14:anchorId="42C7873A" wp14:editId="0D476458">
+              <wp:anchor distT="0" distB="0" distL="114300" distR="114300" simplePos="0" relativeHeight="251806720" behindDoc="0" locked="0" layoutInCell="1" allowOverlap="1" wp14:anchorId="42C7873A" wp14:editId="616B5E7C">
                 <wp:simplePos x="0" y="0"/>
                 <wp:positionH relativeFrom="column">
                   <wp:posOffset>174929</wp:posOffset>
                 </wp:positionH>
                 <wp:positionV relativeFrom="paragraph">
-                  <wp:posOffset>135808</wp:posOffset>
+                  <wp:posOffset>135807</wp:posOffset>
                 </wp:positionV>
-                <wp:extent cx="5591810" cy="3069204"/>
+                <wp:extent cx="5591810" cy="3228230"/>
                 <wp:effectExtent l="0" t="0" r="0" b="0"/>
                 <wp:wrapNone/>
                 <wp:docPr id="906274743" name="Text Box 3"/>
@@ -31479,7 +31467,7 @@
                       <wps:spPr bwMode="auto">
                         <a:xfrm>
                           <a:off x="0" y="0"/>
-                          <a:ext cx="5591810" cy="3069204"/>
+                          <a:ext cx="5591810" cy="3228230"/>
                         </a:xfrm>
                         <a:prstGeom prst="rect">
                           <a:avLst/>
@@ -31539,15 +31527,24 @@
                               <w:spacing w:after="0"/>
                             </w:pPr>
                             <w:r>
-                              <w:t xml:space="preserve">  "data": {</w:t>
-                            </w:r>
-                          </w:p>
-                          <w:p>
-                            <w:pPr>
-                              <w:spacing w:after="0"/>
-                            </w:pPr>
-                            <w:r>
-                              <w:t xml:space="preserve">    "</w:t>
+                              <w:t xml:space="preserve">  "data": </w:t>
+                            </w:r>
+                            <w:r>
+                              <w:t>{</w:t>
+                            </w:r>
+                          </w:p>
+                          <w:p>
+                            <w:pPr>
+                              <w:spacing w:after="0"/>
+                            </w:pPr>
+                            <w:r>
+                              <w:t xml:space="preserve">    </w:t>
+                            </w:r>
+                            <w:r>
+                              <w:t xml:space="preserve">  </w:t>
+                            </w:r>
+                            <w:r>
+                              <w:t>"</w:t>
                             </w:r>
                             <w:proofErr w:type="spellStart"/>
                             <w:proofErr w:type="gramStart"/>
@@ -31560,23 +31557,15 @@
                             </w:r>
                             <w:proofErr w:type="spellEnd"/>
                             <w:r>
-                              <w:t>": "</w:t>
-                            </w:r>
-                            <w:proofErr w:type="spellStart"/>
-                            <w:r>
-                              <w:t>uuid</w:t>
-                            </w:r>
-                            <w:proofErr w:type="spellEnd"/>
-                            <w:r>
-                              <w:t>",</w:t>
-                            </w:r>
-                          </w:p>
-                          <w:p>
-                            <w:pPr>
-                              <w:spacing w:after="0"/>
-                            </w:pPr>
-                            <w:r>
-                              <w:t xml:space="preserve">    "</w:t>
+                              <w:t>": {</w:t>
+                            </w:r>
+                          </w:p>
+                          <w:p>
+                            <w:pPr>
+                              <w:spacing w:after="0"/>
+                            </w:pPr>
+                            <w:r>
+                              <w:t xml:space="preserve">      "</w:t>
                             </w:r>
                             <w:proofErr w:type="spellStart"/>
                             <w:proofErr w:type="gramStart"/>
@@ -31585,19 +31574,19 @@
                             </w:r>
                             <w:proofErr w:type="gramEnd"/>
                             <w:r>
-                              <w:t>_score</w:t>
+                              <w:t>_id</w:t>
                             </w:r>
                             <w:proofErr w:type="spellEnd"/>
                             <w:r>
-                              <w:t>": "string",</w:t>
-                            </w:r>
-                          </w:p>
-                          <w:p>
-                            <w:pPr>
-                              <w:spacing w:after="0"/>
-                            </w:pPr>
-                            <w:r>
-                              <w:t xml:space="preserve">    "</w:t>
+                              <w:t>": "25CD0560-E4DC-4E1B-B51E-2CCD90BEE450",</w:t>
+                            </w:r>
+                          </w:p>
+                          <w:p>
+                            <w:pPr>
+                              <w:spacing w:after="0"/>
+                            </w:pPr>
+                            <w:r>
+                              <w:t xml:space="preserve">      "</w:t>
                             </w:r>
                             <w:proofErr w:type="spellStart"/>
                             <w:proofErr w:type="gramStart"/>
@@ -31606,69 +31595,69 @@
                             </w:r>
                             <w:proofErr w:type="gramEnd"/>
                             <w:r>
-                              <w:t>_description</w:t>
+                              <w:t>_score</w:t>
                             </w:r>
                             <w:proofErr w:type="spellEnd"/>
                             <w:r>
-                              <w:t>": "string",</w:t>
-                            </w:r>
-                          </w:p>
-                          <w:p>
-                            <w:pPr>
-                              <w:spacing w:after="0"/>
-                            </w:pPr>
-                            <w:r>
-                              <w:t xml:space="preserve">    "reflect": "string",</w:t>
-                            </w:r>
-                          </w:p>
-                          <w:p>
-                            <w:pPr>
-                              <w:spacing w:after="0"/>
-                            </w:pPr>
-                            <w:r>
-                              <w:t xml:space="preserve">    "mood": "string",</w:t>
-                            </w:r>
-                          </w:p>
-                          <w:p>
-                            <w:pPr>
-                              <w:spacing w:after="0"/>
-                            </w:pPr>
-                            <w:r>
-                              <w:t xml:space="preserve">    "tag": "string",</w:t>
-                            </w:r>
-                          </w:p>
-                          <w:p>
-                            <w:pPr>
-                              <w:spacing w:after="0"/>
-                            </w:pPr>
-                            <w:r>
-                              <w:t xml:space="preserve">    "</w:t>
+                              <w:t>": "8",</w:t>
+                            </w:r>
+                          </w:p>
+                          <w:p>
+                            <w:pPr>
+                              <w:spacing w:after="0"/>
+                            </w:pPr>
+                            <w:r>
+                              <w:t xml:space="preserve">      "</w:t>
                             </w:r>
                             <w:proofErr w:type="spellStart"/>
                             <w:proofErr w:type="gramStart"/>
                             <w:r>
-                              <w:t>progress</w:t>
+                              <w:t>reflect</w:t>
                             </w:r>
                             <w:proofErr w:type="gramEnd"/>
                             <w:r>
-                              <w:t>_score</w:t>
+                              <w:t>_description</w:t>
                             </w:r>
                             <w:proofErr w:type="spellEnd"/>
                             <w:r>
-                              <w:t>": "string",</w:t>
-                            </w:r>
-                          </w:p>
-                          <w:p>
-                            <w:pPr>
-                              <w:spacing w:after="0"/>
-                            </w:pPr>
-                            <w:r>
-                              <w:t xml:space="preserve">    "</w:t>
+                              <w:t>": "Test learning",</w:t>
+                            </w:r>
+                          </w:p>
+                          <w:p>
+                            <w:pPr>
+                              <w:spacing w:after="0"/>
+                            </w:pPr>
+                            <w:r>
+                              <w:t xml:space="preserve">      "reflect": "Test reflection",</w:t>
+                            </w:r>
+                          </w:p>
+                          <w:p>
+                            <w:pPr>
+                              <w:spacing w:after="0"/>
+                            </w:pPr>
+                            <w:r>
+                              <w:t xml:space="preserve">      "mood": "",</w:t>
+                            </w:r>
+                          </w:p>
+                          <w:p>
+                            <w:pPr>
+                              <w:spacing w:after="0"/>
+                            </w:pPr>
+                            <w:r>
+                              <w:t xml:space="preserve">      "tag": "",</w:t>
+                            </w:r>
+                          </w:p>
+                          <w:p>
+                            <w:pPr>
+                              <w:spacing w:after="0"/>
+                            </w:pPr>
+                            <w:r>
+                              <w:t xml:space="preserve">      "</w:t>
                             </w:r>
                             <w:proofErr w:type="spellStart"/>
                             <w:proofErr w:type="gramStart"/>
                             <w:r>
-                              <w:t>challenge</w:t>
+                              <w:t>progress</w:t>
                             </w:r>
                             <w:proofErr w:type="gramEnd"/>
                             <w:r>
@@ -31676,40 +31665,61 @@
                             </w:r>
                             <w:proofErr w:type="spellEnd"/>
                             <w:r>
-                              <w:t>": "string",</w:t>
-                            </w:r>
-                          </w:p>
-                          <w:p>
-                            <w:pPr>
-                              <w:spacing w:after="0"/>
-                            </w:pPr>
-                            <w:r>
-                              <w:t xml:space="preserve">    "</w:t>
+                              <w:t>": "7",</w:t>
+                            </w:r>
+                          </w:p>
+                          <w:p>
+                            <w:pPr>
+                              <w:spacing w:after="0"/>
+                            </w:pPr>
+                            <w:r>
+                              <w:t xml:space="preserve">      "</w:t>
                             </w:r>
                             <w:proofErr w:type="spellStart"/>
                             <w:proofErr w:type="gramStart"/>
                             <w:r>
-                              <w:t>created</w:t>
+                              <w:t>challenge</w:t>
                             </w:r>
                             <w:proofErr w:type="gramEnd"/>
                             <w:r>
-                              <w:t>_at</w:t>
+                              <w:t>_score</w:t>
                             </w:r>
                             <w:proofErr w:type="spellEnd"/>
                             <w:r>
-                              <w:t>": "2026-01-07T10:30:00Z",</w:t>
-                            </w:r>
-                          </w:p>
-                          <w:p>
-                            <w:pPr>
-                              <w:spacing w:after="0"/>
-                            </w:pPr>
-                            <w:r>
-                              <w:t xml:space="preserve">    "</w:t>
+                              <w:t>": "3",</w:t>
+                            </w:r>
+                          </w:p>
+                          <w:p>
+                            <w:pPr>
+                              <w:spacing w:after="0"/>
+                            </w:pPr>
+                            <w:r>
+                              <w:t xml:space="preserve">      "</w:t>
                             </w:r>
                             <w:proofErr w:type="spellStart"/>
                             <w:proofErr w:type="gramStart"/>
                             <w:r>
+                              <w:t>created</w:t>
+                            </w:r>
+                            <w:proofErr w:type="gramEnd"/>
+                            <w:r>
+                              <w:t>_at</w:t>
+                            </w:r>
+                            <w:proofErr w:type="spellEnd"/>
+                            <w:r>
+                              <w:t>": "2026-01-18T06:31:08.6066667Z",</w:t>
+                            </w:r>
+                          </w:p>
+                          <w:p>
+                            <w:pPr>
+                              <w:spacing w:after="0"/>
+                            </w:pPr>
+                            <w:r>
+                              <w:t xml:space="preserve">      "</w:t>
+                            </w:r>
+                            <w:proofErr w:type="spellStart"/>
+                            <w:proofErr w:type="gramStart"/>
+                            <w:r>
                               <w:t>tree</w:t>
                             </w:r>
                             <w:proofErr w:type="gramEnd"/>
@@ -31718,23 +31728,15 @@
                             </w:r>
                             <w:proofErr w:type="spellEnd"/>
                             <w:r>
-                              <w:t>": "</w:t>
-                            </w:r>
-                            <w:proofErr w:type="spellStart"/>
-                            <w:r>
-                              <w:t>uuid</w:t>
-                            </w:r>
-                            <w:proofErr w:type="spellEnd"/>
-                            <w:r>
-                              <w:t>"</w:t>
-                            </w:r>
-                          </w:p>
-                          <w:p>
-                            <w:pPr>
-                              <w:spacing w:after="0"/>
-                            </w:pPr>
-                            <w:r>
-                              <w:t xml:space="preserve">  }</w:t>
+                              <w:t>": "22222222-3333-4444-5555-666666666666"</w:t>
+                            </w:r>
+                          </w:p>
+                          <w:p>
+                            <w:pPr>
+                              <w:spacing w:after="0"/>
+                            </w:pPr>
+                            <w:r>
+                              <w:t xml:space="preserve">    }</w:t>
                             </w:r>
                           </w:p>
                           <w:p>
@@ -31764,7 +31766,7 @@
           </mc:Choice>
           <mc:Fallback>
             <w:pict>
-              <v:shape w14:anchorId="42C7873A" id="_x0000_s1066" type="#_x0000_t202" style="position:absolute;left:0;text-align:left;margin-left:13.75pt;margin-top:10.7pt;width:440.3pt;height:241.65pt;z-index:251806720;visibility:visible;mso-wrap-style:square;mso-width-percent:0;mso-height-percent:0;mso-wrap-distance-left:9pt;mso-wrap-distance-top:0;mso-wrap-distance-right:9pt;mso-wrap-distance-bottom:0;mso-position-horizontal:absolute;mso-position-horizontal-relative:text;mso-position-vertical:absolute;mso-position-vertical-relative:text;mso-width-percent:0;mso-height-percent:0;mso-width-relative:page;mso-height-relative:page;v-text-anchor:top" o:gfxdata="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" filled="f" stroked="f">
+              <v:shape w14:anchorId="42C7873A" id="_x0000_s1066" type="#_x0000_t202" style="position:absolute;left:0;text-align:left;margin-left:13.75pt;margin-top:10.7pt;width:440.3pt;height:254.2pt;z-index:251806720;visibility:visible;mso-wrap-style:square;mso-width-percent:0;mso-height-percent:0;mso-wrap-distance-left:9pt;mso-wrap-distance-top:0;mso-wrap-distance-right:9pt;mso-wrap-distance-bottom:0;mso-position-horizontal:absolute;mso-position-horizontal-relative:text;mso-position-vertical:absolute;mso-position-vertical-relative:text;mso-width-percent:0;mso-height-percent:0;mso-width-relative:page;mso-height-relative:page;v-text-anchor:top" o:gfxdata="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" filled="f" stroked="f">
                 <v:textbox>
                   <w:txbxContent>
                     <w:p>
@@ -31796,15 +31798,24 @@
                         <w:spacing w:after="0"/>
                       </w:pPr>
                       <w:r>
-                        <w:t xml:space="preserve">  "data": {</w:t>
-                      </w:r>
-                    </w:p>
-                    <w:p>
-                      <w:pPr>
-                        <w:spacing w:after="0"/>
-                      </w:pPr>
-                      <w:r>
-                        <w:t xml:space="preserve">    "</w:t>
+                        <w:t xml:space="preserve">  "data": </w:t>
+                      </w:r>
+                      <w:r>
+                        <w:t>{</w:t>
+                      </w:r>
+                    </w:p>
+                    <w:p>
+                      <w:pPr>
+                        <w:spacing w:after="0"/>
+                      </w:pPr>
+                      <w:r>
+                        <w:t xml:space="preserve">    </w:t>
+                      </w:r>
+                      <w:r>
+                        <w:t xml:space="preserve">  </w:t>
+                      </w:r>
+                      <w:r>
+                        <w:t>"</w:t>
                       </w:r>
                       <w:proofErr w:type="spellStart"/>
                       <w:proofErr w:type="gramStart"/>
@@ -31817,23 +31828,15 @@
                       </w:r>
                       <w:proofErr w:type="spellEnd"/>
                       <w:r>
-                        <w:t>": "</w:t>
-                      </w:r>
-                      <w:proofErr w:type="spellStart"/>
-                      <w:r>
-                        <w:t>uuid</w:t>
-                      </w:r>
-                      <w:proofErr w:type="spellEnd"/>
-                      <w:r>
-                        <w:t>",</w:t>
-                      </w:r>
-                    </w:p>
-                    <w:p>
-                      <w:pPr>
-                        <w:spacing w:after="0"/>
-                      </w:pPr>
-                      <w:r>
-                        <w:t xml:space="preserve">    "</w:t>
+                        <w:t>": {</w:t>
+                      </w:r>
+                    </w:p>
+                    <w:p>
+                      <w:pPr>
+                        <w:spacing w:after="0"/>
+                      </w:pPr>
+                      <w:r>
+                        <w:t xml:space="preserve">      "</w:t>
                       </w:r>
                       <w:proofErr w:type="spellStart"/>
                       <w:proofErr w:type="gramStart"/>
@@ -31842,19 +31845,19 @@
                       </w:r>
                       <w:proofErr w:type="gramEnd"/>
                       <w:r>
-                        <w:t>_score</w:t>
+                        <w:t>_id</w:t>
                       </w:r>
                       <w:proofErr w:type="spellEnd"/>
                       <w:r>
-                        <w:t>": "string",</w:t>
-                      </w:r>
-                    </w:p>
-                    <w:p>
-                      <w:pPr>
-                        <w:spacing w:after="0"/>
-                      </w:pPr>
-                      <w:r>
-                        <w:t xml:space="preserve">    "</w:t>
+                        <w:t>": "25CD0560-E4DC-4E1B-B51E-2CCD90BEE450",</w:t>
+                      </w:r>
+                    </w:p>
+                    <w:p>
+                      <w:pPr>
+                        <w:spacing w:after="0"/>
+                      </w:pPr>
+                      <w:r>
+                        <w:t xml:space="preserve">      "</w:t>
                       </w:r>
                       <w:proofErr w:type="spellStart"/>
                       <w:proofErr w:type="gramStart"/>
@@ -31863,69 +31866,69 @@
                       </w:r>
                       <w:proofErr w:type="gramEnd"/>
                       <w:r>
-                        <w:t>_description</w:t>
+                        <w:t>_score</w:t>
                       </w:r>
                       <w:proofErr w:type="spellEnd"/>
                       <w:r>
-                        <w:t>": "string",</w:t>
-                      </w:r>
-                    </w:p>
-                    <w:p>
-                      <w:pPr>
-                        <w:spacing w:after="0"/>
-                      </w:pPr>
-                      <w:r>
-                        <w:t xml:space="preserve">    "reflect": "string",</w:t>
-                      </w:r>
-                    </w:p>
-                    <w:p>
-                      <w:pPr>
-                        <w:spacing w:after="0"/>
-                      </w:pPr>
-                      <w:r>
-                        <w:t xml:space="preserve">    "mood": "string",</w:t>
-                      </w:r>
-                    </w:p>
-                    <w:p>
-                      <w:pPr>
-                        <w:spacing w:after="0"/>
-                      </w:pPr>
-                      <w:r>
-                        <w:t xml:space="preserve">    "tag": "string",</w:t>
-                      </w:r>
-                    </w:p>
-                    <w:p>
-                      <w:pPr>
-                        <w:spacing w:after="0"/>
-                      </w:pPr>
-                      <w:r>
-                        <w:t xml:space="preserve">    "</w:t>
+                        <w:t>": "8",</w:t>
+                      </w:r>
+                    </w:p>
+                    <w:p>
+                      <w:pPr>
+                        <w:spacing w:after="0"/>
+                      </w:pPr>
+                      <w:r>
+                        <w:t xml:space="preserve">      "</w:t>
                       </w:r>
                       <w:proofErr w:type="spellStart"/>
                       <w:proofErr w:type="gramStart"/>
                       <w:r>
-                        <w:t>progress</w:t>
+                        <w:t>reflect</w:t>
                       </w:r>
                       <w:proofErr w:type="gramEnd"/>
                       <w:r>
-                        <w:t>_score</w:t>
+                        <w:t>_description</w:t>
                       </w:r>
                       <w:proofErr w:type="spellEnd"/>
                       <w:r>
-                        <w:t>": "string",</w:t>
-                      </w:r>
-                    </w:p>
-                    <w:p>
-                      <w:pPr>
-                        <w:spacing w:after="0"/>
-                      </w:pPr>
-                      <w:r>
-                        <w:t xml:space="preserve">    "</w:t>
+                        <w:t>": "Test learning",</w:t>
+                      </w:r>
+                    </w:p>
+                    <w:p>
+                      <w:pPr>
+                        <w:spacing w:after="0"/>
+                      </w:pPr>
+                      <w:r>
+                        <w:t xml:space="preserve">      "reflect": "Test reflection",</w:t>
+                      </w:r>
+                    </w:p>
+                    <w:p>
+                      <w:pPr>
+                        <w:spacing w:after="0"/>
+                      </w:pPr>
+                      <w:r>
+                        <w:t xml:space="preserve">      "mood": "",</w:t>
+                      </w:r>
+                    </w:p>
+                    <w:p>
+                      <w:pPr>
+                        <w:spacing w:after="0"/>
+                      </w:pPr>
+                      <w:r>
+                        <w:t xml:space="preserve">      "tag": "",</w:t>
+                      </w:r>
+                    </w:p>
+                    <w:p>
+                      <w:pPr>
+                        <w:spacing w:after="0"/>
+                      </w:pPr>
+                      <w:r>
+                        <w:t xml:space="preserve">      "</w:t>
                       </w:r>
                       <w:proofErr w:type="spellStart"/>
                       <w:proofErr w:type="gramStart"/>
                       <w:r>
-                        <w:t>challenge</w:t>
+                        <w:t>progress</w:t>
                       </w:r>
                       <w:proofErr w:type="gramEnd"/>
                       <w:r>
@@ -31933,40 +31936,61 @@
                       </w:r>
                       <w:proofErr w:type="spellEnd"/>
                       <w:r>
-                        <w:t>": "string",</w:t>
-                      </w:r>
-                    </w:p>
-                    <w:p>
-                      <w:pPr>
-                        <w:spacing w:after="0"/>
-                      </w:pPr>
-                      <w:r>
-                        <w:t xml:space="preserve">    "</w:t>
+                        <w:t>": "7",</w:t>
+                      </w:r>
+                    </w:p>
+                    <w:p>
+                      <w:pPr>
+                        <w:spacing w:after="0"/>
+                      </w:pPr>
+                      <w:r>
+                        <w:t xml:space="preserve">      "</w:t>
                       </w:r>
                       <w:proofErr w:type="spellStart"/>
                       <w:proofErr w:type="gramStart"/>
                       <w:r>
-                        <w:t>created</w:t>
+                        <w:t>challenge</w:t>
                       </w:r>
                       <w:proofErr w:type="gramEnd"/>
                       <w:r>
-                        <w:t>_at</w:t>
+                        <w:t>_score</w:t>
                       </w:r>
                       <w:proofErr w:type="spellEnd"/>
                       <w:r>
-                        <w:t>": "2026-01-07T10:30:00Z",</w:t>
-                      </w:r>
-                    </w:p>
-                    <w:p>
-                      <w:pPr>
-                        <w:spacing w:after="0"/>
-                      </w:pPr>
-                      <w:r>
-                        <w:t xml:space="preserve">    "</w:t>
+                        <w:t>": "3",</w:t>
+                      </w:r>
+                    </w:p>
+                    <w:p>
+                      <w:pPr>
+                        <w:spacing w:after="0"/>
+                      </w:pPr>
+                      <w:r>
+                        <w:t xml:space="preserve">      "</w:t>
                       </w:r>
                       <w:proofErr w:type="spellStart"/>
                       <w:proofErr w:type="gramStart"/>
                       <w:r>
+                        <w:t>created</w:t>
+                      </w:r>
+                      <w:proofErr w:type="gramEnd"/>
+                      <w:r>
+                        <w:t>_at</w:t>
+                      </w:r>
+                      <w:proofErr w:type="spellEnd"/>
+                      <w:r>
+                        <w:t>": "2026-01-18T06:31:08.6066667Z",</w:t>
+                      </w:r>
+                    </w:p>
+                    <w:p>
+                      <w:pPr>
+                        <w:spacing w:after="0"/>
+                      </w:pPr>
+                      <w:r>
+                        <w:t xml:space="preserve">      "</w:t>
+                      </w:r>
+                      <w:proofErr w:type="spellStart"/>
+                      <w:proofErr w:type="gramStart"/>
+                      <w:r>
                         <w:t>tree</w:t>
                       </w:r>
                       <w:proofErr w:type="gramEnd"/>
@@ -31975,23 +31999,15 @@
                       </w:r>
                       <w:proofErr w:type="spellEnd"/>
                       <w:r>
-                        <w:t>": "</w:t>
-                      </w:r>
-                      <w:proofErr w:type="spellStart"/>
-                      <w:r>
-                        <w:t>uuid</w:t>
-                      </w:r>
-                      <w:proofErr w:type="spellEnd"/>
-                      <w:r>
-                        <w:t>"</w:t>
-                      </w:r>
-                    </w:p>
-                    <w:p>
-                      <w:pPr>
-                        <w:spacing w:after="0"/>
-                      </w:pPr>
-                      <w:r>
-                        <w:t xml:space="preserve">  }</w:t>
+                        <w:t>": "22222222-3333-4444-5555-666666666666"</w:t>
+                      </w:r>
+                    </w:p>
+                    <w:p>
+                      <w:pPr>
+                        <w:spacing w:after="0"/>
+                      </w:pPr>
+                      <w:r>
+                        <w:t xml:space="preserve">    }</w:t>
                       </w:r>
                     </w:p>
                     <w:p>
@@ -32235,6 +32251,7 @@
           <w:sz w:val="32"/>
           <w:szCs w:val="32"/>
         </w:rPr>
+        <w:lastRenderedPageBreak/>
         <w:t>Create Reflection</w:t>
       </w:r>
     </w:p>
@@ -32256,7 +32273,6 @@
           <w:sz w:val="32"/>
           <w:szCs w:val="32"/>
         </w:rPr>
-        <w:lastRenderedPageBreak/>
         <w:t>Port :</w:t>
       </w:r>
       <w:proofErr w:type="gramEnd"/>
@@ -32463,1336 +32479,7 @@
         <mc:AlternateContent>
           <mc:Choice Requires="wps">
             <w:drawing>
-              <wp:anchor distT="0" distB="0" distL="114300" distR="114300" simplePos="0" relativeHeight="251808768" behindDoc="0" locked="0" layoutInCell="1" allowOverlap="1" wp14:anchorId="42818DF8" wp14:editId="00A41F1D">
-                <wp:simplePos x="0" y="0"/>
-                <wp:positionH relativeFrom="margin">
-                  <wp:align>right</wp:align>
-                </wp:positionH>
-                <wp:positionV relativeFrom="paragraph">
-                  <wp:posOffset>27940</wp:posOffset>
-                </wp:positionV>
-                <wp:extent cx="5925820" cy="2266122"/>
-                <wp:effectExtent l="0" t="0" r="17780" b="20320"/>
-                <wp:wrapNone/>
-                <wp:docPr id="829724434" name="Rectangle 2"/>
-                <wp:cNvGraphicFramePr>
-                  <a:graphicFrameLocks xmlns:a="http://schemas.openxmlformats.org/drawingml/2006/main"/>
-                </wp:cNvGraphicFramePr>
-                <a:graphic xmlns:a="http://schemas.openxmlformats.org/drawingml/2006/main">
-                  <a:graphicData uri="http://schemas.microsoft.com/office/word/2010/wordprocessingShape">
-                    <wps:wsp>
-                      <wps:cNvSpPr>
-                        <a:spLocks noChangeArrowheads="1"/>
-                      </wps:cNvSpPr>
-                      <wps:spPr bwMode="auto">
-                        <a:xfrm>
-                          <a:off x="0" y="0"/>
-                          <a:ext cx="5925820" cy="2266122"/>
-                        </a:xfrm>
-                        <a:prstGeom prst="rect">
-                          <a:avLst/>
-                        </a:prstGeom>
-                        <a:solidFill>
-                          <a:schemeClr val="bg1">
-                            <a:lumMod val="85000"/>
-                            <a:lumOff val="0"/>
-                          </a:schemeClr>
-                        </a:solidFill>
-                        <a:ln w="9525">
-                          <a:solidFill>
-                            <a:srgbClr val="000000"/>
-                          </a:solidFill>
-                          <a:miter lim="800000"/>
-                          <a:headEnd/>
-                          <a:tailEnd/>
-                        </a:ln>
-                      </wps:spPr>
-                      <wps:bodyPr rot="0" vert="horz" wrap="square" lIns="91440" tIns="45720" rIns="91440" bIns="45720" anchor="t" anchorCtr="0" upright="1">
-                        <a:noAutofit/>
-                      </wps:bodyPr>
-                    </wps:wsp>
-                  </a:graphicData>
-                </a:graphic>
-                <wp14:sizeRelH relativeFrom="page">
-                  <wp14:pctWidth>0</wp14:pctWidth>
-                </wp14:sizeRelH>
-                <wp14:sizeRelV relativeFrom="page">
-                  <wp14:pctHeight>0</wp14:pctHeight>
-                </wp14:sizeRelV>
-              </wp:anchor>
-            </w:drawing>
-          </mc:Choice>
-          <mc:Fallback>
-            <w:pict>
-              <v:rect w14:anchorId="654351F4" id="Rectangle 2" o:spid="_x0000_s1026" style="position:absolute;margin-left:415.4pt;margin-top:2.2pt;width:466.6pt;height:178.45pt;z-index:251808768;visibility:visible;mso-wrap-style:square;mso-width-percent:0;mso-height-percent:0;mso-wrap-distance-left:9pt;mso-wrap-distance-top:0;mso-wrap-distance-right:9pt;mso-wrap-distance-bottom:0;mso-position-horizontal:right;mso-position-horizontal-relative:margin;mso-position-vertical:absolute;mso-position-vertical-relative:text;mso-width-percent:0;mso-height-percent:0;mso-width-relative:page;mso-height-relative:page;v-text-anchor:top" o:gfxdata="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" fillcolor="#d8d8d8 [2732]">
-                <w10:wrap anchorx="margin"/>
-              </v:rect>
-            </w:pict>
-          </mc:Fallback>
-        </mc:AlternateContent>
-      </w:r>
-      <w:r>
-        <w:rPr>
-          <w:noProof/>
-        </w:rPr>
-        <mc:AlternateContent>
-          <mc:Choice Requires="wps">
-            <w:drawing>
-              <wp:anchor distT="0" distB="0" distL="114300" distR="114300" simplePos="0" relativeHeight="251809792" behindDoc="0" locked="0" layoutInCell="1" allowOverlap="1" wp14:anchorId="77931A85" wp14:editId="4B56ADA3">
-                <wp:simplePos x="0" y="0"/>
-                <wp:positionH relativeFrom="column">
-                  <wp:posOffset>174929</wp:posOffset>
-                </wp:positionH>
-                <wp:positionV relativeFrom="paragraph">
-                  <wp:posOffset>135034</wp:posOffset>
-                </wp:positionV>
-                <wp:extent cx="5591810" cy="2115047"/>
-                <wp:effectExtent l="0" t="0" r="0" b="0"/>
-                <wp:wrapNone/>
-                <wp:docPr id="110113225" name="Text Box 3"/>
-                <wp:cNvGraphicFramePr>
-                  <a:graphicFrameLocks xmlns:a="http://schemas.openxmlformats.org/drawingml/2006/main"/>
-                </wp:cNvGraphicFramePr>
-                <a:graphic xmlns:a="http://schemas.openxmlformats.org/drawingml/2006/main">
-                  <a:graphicData uri="http://schemas.microsoft.com/office/word/2010/wordprocessingShape">
-                    <wps:wsp>
-                      <wps:cNvSpPr txBox="1">
-                        <a:spLocks noChangeArrowheads="1"/>
-                      </wps:cNvSpPr>
-                      <wps:spPr bwMode="auto">
-                        <a:xfrm>
-                          <a:off x="0" y="0"/>
-                          <a:ext cx="5591810" cy="2115047"/>
-                        </a:xfrm>
-                        <a:prstGeom prst="rect">
-                          <a:avLst/>
-                        </a:prstGeom>
-                        <a:noFill/>
-                        <a:ln>
-                          <a:noFill/>
-                        </a:ln>
-                        <a:extLst>
-                          <a:ext uri="{909E8E84-426E-40DD-AFC4-6F175D3DCCD1}">
-                            <a14:hiddenFill xmlns:a14="http://schemas.microsoft.com/office/drawing/2010/main">
-                              <a:solidFill>
-                                <a:srgbClr val="FFFFFF"/>
-                              </a:solidFill>
-                            </a14:hiddenFill>
-                          </a:ext>
-                          <a:ext uri="{91240B29-F687-4F45-9708-019B960494DF}">
-                            <a14:hiddenLine xmlns:a14="http://schemas.microsoft.com/office/drawing/2010/main" w="9525">
-                              <a:solidFill>
-                                <a:srgbClr val="000000"/>
-                              </a:solidFill>
-                              <a:miter lim="800000"/>
-                              <a:headEnd/>
-                              <a:tailEnd/>
-                            </a14:hiddenLine>
-                          </a:ext>
-                        </a:extLst>
-                      </wps:spPr>
-                      <wps:txbx>
-                        <w:txbxContent>
-                          <w:p>
-                            <w:pPr>
-                              <w:spacing w:after="0"/>
-                            </w:pPr>
-                            <w:r>
-                              <w:t>{</w:t>
-                            </w:r>
-                          </w:p>
-                          <w:p>
-                            <w:pPr>
-                              <w:spacing w:after="0"/>
-                            </w:pPr>
-                            <w:r>
-                              <w:t xml:space="preserve">  "learned": "string (required) - </w:t>
-                            </w:r>
-                            <w:r>
-                              <w:rPr>
-                                <w:cs/>
-                              </w:rPr>
-                              <w:t>สิ่งที่เรียนรู้"</w:t>
-                            </w:r>
-                            <w:r>
-                              <w:t>,</w:t>
-                            </w:r>
-                          </w:p>
-                          <w:p>
-                            <w:pPr>
-                              <w:spacing w:after="0"/>
-                            </w:pPr>
-                            <w:r>
-                              <w:t xml:space="preserve">  "</w:t>
-                            </w:r>
-                            <w:proofErr w:type="spellStart"/>
-                            <w:proofErr w:type="gramStart"/>
-                            <w:r>
-                              <w:t>feel</w:t>
-                            </w:r>
-                            <w:proofErr w:type="gramEnd"/>
-                            <w:r>
-                              <w:t>_score</w:t>
-                            </w:r>
-                            <w:proofErr w:type="spellEnd"/>
-                            <w:r>
-                              <w:t xml:space="preserve">": "string (required) - </w:t>
-                            </w:r>
-                            <w:r>
-                              <w:rPr>
-                                <w:cs/>
-                              </w:rPr>
-                              <w:t>คะแนนความรู้สึก"</w:t>
-                            </w:r>
-                            <w:r>
-                              <w:t>,</w:t>
-                            </w:r>
-                          </w:p>
-                          <w:p>
-                            <w:pPr>
-                              <w:spacing w:after="0"/>
-                            </w:pPr>
-                            <w:r>
-                              <w:t xml:space="preserve">  "reflect": "string (required) - </w:t>
-                            </w:r>
-                            <w:r>
-                              <w:rPr>
-                                <w:cs/>
-                              </w:rPr>
-                              <w:t xml:space="preserve">เนื้อหา </w:t>
-                            </w:r>
-                            <w:r>
-                              <w:t>Reflection",</w:t>
-                            </w:r>
-                          </w:p>
-                          <w:p>
-                            <w:pPr>
-                              <w:spacing w:after="0"/>
-                            </w:pPr>
-                            <w:r>
-                              <w:t xml:space="preserve">  "</w:t>
-                            </w:r>
-                            <w:proofErr w:type="spellStart"/>
-                            <w:proofErr w:type="gramStart"/>
-                            <w:r>
-                              <w:t>progress</w:t>
-                            </w:r>
-                            <w:proofErr w:type="gramEnd"/>
-                            <w:r>
-                              <w:t>_score</w:t>
-                            </w:r>
-                            <w:proofErr w:type="spellEnd"/>
-                            <w:r>
-                              <w:t xml:space="preserve">": "string (required) - </w:t>
-                            </w:r>
-                            <w:r>
-                              <w:rPr>
-                                <w:cs/>
-                              </w:rPr>
-                              <w:t>คะแนนความก้าวหน้า"</w:t>
-                            </w:r>
-                            <w:r>
-                              <w:t>,</w:t>
-                            </w:r>
-                          </w:p>
-                          <w:p>
-                            <w:pPr>
-                              <w:spacing w:after="0"/>
-                            </w:pPr>
-                            <w:r>
-                              <w:t xml:space="preserve">  "</w:t>
-                            </w:r>
-                            <w:proofErr w:type="spellStart"/>
-                            <w:proofErr w:type="gramStart"/>
-                            <w:r>
-                              <w:t>challenge</w:t>
-                            </w:r>
-                            <w:proofErr w:type="gramEnd"/>
-                            <w:r>
-                              <w:t>_score</w:t>
-                            </w:r>
-                            <w:proofErr w:type="spellEnd"/>
-                            <w:r>
-                              <w:t xml:space="preserve">": "string (required) - </w:t>
-                            </w:r>
-                            <w:r>
-                              <w:rPr>
-                                <w:cs/>
-                              </w:rPr>
-                              <w:t>คะแนนความท้าทาย"</w:t>
-                            </w:r>
-                            <w:r>
-                              <w:t>,</w:t>
-                            </w:r>
-                          </w:p>
-                          <w:p>
-                            <w:pPr>
-                              <w:spacing w:after="0"/>
-                            </w:pPr>
-                            <w:r>
-                              <w:t xml:space="preserve">  "</w:t>
-                            </w:r>
-                            <w:proofErr w:type="spellStart"/>
-                            <w:proofErr w:type="gramStart"/>
-                            <w:r>
-                              <w:t>tree</w:t>
-                            </w:r>
-                            <w:proofErr w:type="gramEnd"/>
-                            <w:r>
-                              <w:t>_node_id</w:t>
-                            </w:r>
-                            <w:proofErr w:type="spellEnd"/>
-                            <w:r>
-                              <w:t xml:space="preserve">": "string (required) - ID </w:t>
-                            </w:r>
-                            <w:r>
-                              <w:rPr>
-                                <w:cs/>
-                              </w:rPr>
-                              <w:t>ของ</w:t>
-                            </w:r>
-                            <w:proofErr w:type="spellStart"/>
-                            <w:r>
-                              <w:rPr>
-                                <w:cs/>
-                              </w:rPr>
-                              <w:t>โหนด</w:t>
-                            </w:r>
-                            <w:proofErr w:type="spellEnd"/>
-                            <w:r>
-                              <w:rPr>
-                                <w:cs/>
-                              </w:rPr>
-                              <w:t>ในต้นไม้"</w:t>
-                            </w:r>
-                          </w:p>
-                          <w:p>
-                            <w:pPr>
-                              <w:spacing w:after="0"/>
-                            </w:pPr>
-                            <w:r>
-                              <w:t>}</w:t>
-                            </w:r>
-                          </w:p>
-                        </w:txbxContent>
-                      </wps:txbx>
-                      <wps:bodyPr rot="0" vert="horz" wrap="square" lIns="91440" tIns="45720" rIns="91440" bIns="45720" anchor="t" anchorCtr="0" upright="1">
-                        <a:noAutofit/>
-                      </wps:bodyPr>
-                    </wps:wsp>
-                  </a:graphicData>
-                </a:graphic>
-                <wp14:sizeRelH relativeFrom="page">
-                  <wp14:pctWidth>0</wp14:pctWidth>
-                </wp14:sizeRelH>
-                <wp14:sizeRelV relativeFrom="page">
-                  <wp14:pctHeight>0</wp14:pctHeight>
-                </wp14:sizeRelV>
-              </wp:anchor>
-            </w:drawing>
-          </mc:Choice>
-          <mc:Fallback>
-            <w:pict>
-              <v:shape w14:anchorId="77931A85" id="_x0000_s1067" type="#_x0000_t202" style="position:absolute;left:0;text-align:left;margin-left:13.75pt;margin-top:10.65pt;width:440.3pt;height:166.55pt;z-index:251809792;visibility:visible;mso-wrap-style:square;mso-width-percent:0;mso-height-percent:0;mso-wrap-distance-left:9pt;mso-wrap-distance-top:0;mso-wrap-distance-right:9pt;mso-wrap-distance-bottom:0;mso-position-horizontal:absolute;mso-position-horizontal-relative:text;mso-position-vertical:absolute;mso-position-vertical-relative:text;mso-width-percent:0;mso-height-percent:0;mso-width-relative:page;mso-height-relative:page;v-text-anchor:top" o:gfxdata="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" filled="f" stroked="f">
-                <v:textbox>
-                  <w:txbxContent>
-                    <w:p>
-                      <w:pPr>
-                        <w:spacing w:after="0"/>
-                      </w:pPr>
-                      <w:r>
-                        <w:t>{</w:t>
-                      </w:r>
-                    </w:p>
-                    <w:p>
-                      <w:pPr>
-                        <w:spacing w:after="0"/>
-                      </w:pPr>
-                      <w:r>
-                        <w:t xml:space="preserve">  "learned": "string (required) - </w:t>
-                      </w:r>
-                      <w:r>
-                        <w:rPr>
-                          <w:cs/>
-                        </w:rPr>
-                        <w:t>สิ่งที่เรียนรู้"</w:t>
-                      </w:r>
-                      <w:r>
-                        <w:t>,</w:t>
-                      </w:r>
-                    </w:p>
-                    <w:p>
-                      <w:pPr>
-                        <w:spacing w:after="0"/>
-                      </w:pPr>
-                      <w:r>
-                        <w:t xml:space="preserve">  "</w:t>
-                      </w:r>
-                      <w:proofErr w:type="spellStart"/>
-                      <w:proofErr w:type="gramStart"/>
-                      <w:r>
-                        <w:t>feel</w:t>
-                      </w:r>
-                      <w:proofErr w:type="gramEnd"/>
-                      <w:r>
-                        <w:t>_score</w:t>
-                      </w:r>
-                      <w:proofErr w:type="spellEnd"/>
-                      <w:r>
-                        <w:t xml:space="preserve">": "string (required) - </w:t>
-                      </w:r>
-                      <w:r>
-                        <w:rPr>
-                          <w:cs/>
-                        </w:rPr>
-                        <w:t>คะแนนความรู้สึก"</w:t>
-                      </w:r>
-                      <w:r>
-                        <w:t>,</w:t>
-                      </w:r>
-                    </w:p>
-                    <w:p>
-                      <w:pPr>
-                        <w:spacing w:after="0"/>
-                      </w:pPr>
-                      <w:r>
-                        <w:t xml:space="preserve">  "reflect": "string (required) - </w:t>
-                      </w:r>
-                      <w:r>
-                        <w:rPr>
-                          <w:cs/>
-                        </w:rPr>
-                        <w:t xml:space="preserve">เนื้อหา </w:t>
-                      </w:r>
-                      <w:r>
-                        <w:t>Reflection",</w:t>
-                      </w:r>
-                    </w:p>
-                    <w:p>
-                      <w:pPr>
-                        <w:spacing w:after="0"/>
-                      </w:pPr>
-                      <w:r>
-                        <w:t xml:space="preserve">  "</w:t>
-                      </w:r>
-                      <w:proofErr w:type="spellStart"/>
-                      <w:proofErr w:type="gramStart"/>
-                      <w:r>
-                        <w:t>progress</w:t>
-                      </w:r>
-                      <w:proofErr w:type="gramEnd"/>
-                      <w:r>
-                        <w:t>_score</w:t>
-                      </w:r>
-                      <w:proofErr w:type="spellEnd"/>
-                      <w:r>
-                        <w:t xml:space="preserve">": "string (required) - </w:t>
-                      </w:r>
-                      <w:r>
-                        <w:rPr>
-                          <w:cs/>
-                        </w:rPr>
-                        <w:t>คะแนนความก้าวหน้า"</w:t>
-                      </w:r>
-                      <w:r>
-                        <w:t>,</w:t>
-                      </w:r>
-                    </w:p>
-                    <w:p>
-                      <w:pPr>
-                        <w:spacing w:after="0"/>
-                      </w:pPr>
-                      <w:r>
-                        <w:t xml:space="preserve">  "</w:t>
-                      </w:r>
-                      <w:proofErr w:type="spellStart"/>
-                      <w:proofErr w:type="gramStart"/>
-                      <w:r>
-                        <w:t>challenge</w:t>
-                      </w:r>
-                      <w:proofErr w:type="gramEnd"/>
-                      <w:r>
-                        <w:t>_score</w:t>
-                      </w:r>
-                      <w:proofErr w:type="spellEnd"/>
-                      <w:r>
-                        <w:t xml:space="preserve">": "string (required) - </w:t>
-                      </w:r>
-                      <w:r>
-                        <w:rPr>
-                          <w:cs/>
-                        </w:rPr>
-                        <w:t>คะแนนความท้าทาย"</w:t>
-                      </w:r>
-                      <w:r>
-                        <w:t>,</w:t>
-                      </w:r>
-                    </w:p>
-                    <w:p>
-                      <w:pPr>
-                        <w:spacing w:after="0"/>
-                      </w:pPr>
-                      <w:r>
-                        <w:t xml:space="preserve">  "</w:t>
-                      </w:r>
-                      <w:proofErr w:type="spellStart"/>
-                      <w:proofErr w:type="gramStart"/>
-                      <w:r>
-                        <w:t>tree</w:t>
-                      </w:r>
-                      <w:proofErr w:type="gramEnd"/>
-                      <w:r>
-                        <w:t>_node_id</w:t>
-                      </w:r>
-                      <w:proofErr w:type="spellEnd"/>
-                      <w:r>
-                        <w:t xml:space="preserve">": "string (required) - ID </w:t>
-                      </w:r>
-                      <w:r>
-                        <w:rPr>
-                          <w:cs/>
-                        </w:rPr>
-                        <w:t>ของ</w:t>
-                      </w:r>
-                      <w:proofErr w:type="spellStart"/>
-                      <w:r>
-                        <w:rPr>
-                          <w:cs/>
-                        </w:rPr>
-                        <w:t>โหนด</w:t>
-                      </w:r>
-                      <w:proofErr w:type="spellEnd"/>
-                      <w:r>
-                        <w:rPr>
-                          <w:cs/>
-                        </w:rPr>
-                        <w:t>ในต้นไม้"</w:t>
-                      </w:r>
-                    </w:p>
-                    <w:p>
-                      <w:pPr>
-                        <w:spacing w:after="0"/>
-                      </w:pPr>
-                      <w:r>
-                        <w:t>}</w:t>
-                      </w:r>
-                    </w:p>
-                  </w:txbxContent>
-                </v:textbox>
-              </v:shape>
-            </w:pict>
-          </mc:Fallback>
-        </mc:AlternateContent>
-      </w:r>
-    </w:p>
-    <w:p>
-      <w:pPr>
-        <w:spacing w:after="0"/>
-        <w:rPr>
-          <w:rFonts w:ascii="TH SarabunPSK" w:hAnsi="TH SarabunPSK" w:cs="TH SarabunPSK"/>
-          <w:sz w:val="36"/>
-          <w:szCs w:val="36"/>
-        </w:rPr>
-      </w:pPr>
-    </w:p>
-    <w:p>
-      <w:pPr>
-        <w:spacing w:after="0"/>
-        <w:ind w:left="360"/>
-        <w:rPr>
-          <w:rFonts w:ascii="TH SarabunPSK" w:hAnsi="TH SarabunPSK" w:cs="TH SarabunPSK"/>
-          <w:sz w:val="36"/>
-          <w:szCs w:val="36"/>
-        </w:rPr>
-      </w:pPr>
-    </w:p>
-    <w:p>
-      <w:pPr>
-        <w:spacing w:after="0"/>
-        <w:rPr>
-          <w:rFonts w:ascii="TH SarabunPSK" w:hAnsi="TH SarabunPSK" w:cs="TH SarabunPSK"/>
-          <w:sz w:val="32"/>
-          <w:szCs w:val="32"/>
-        </w:rPr>
-      </w:pPr>
-    </w:p>
-    <w:p>
-      <w:pPr>
-        <w:spacing w:after="0"/>
-        <w:rPr>
-          <w:rFonts w:ascii="TH SarabunPSK" w:hAnsi="TH SarabunPSK" w:cs="TH SarabunPSK"/>
-          <w:sz w:val="36"/>
-          <w:szCs w:val="36"/>
-        </w:rPr>
-      </w:pPr>
-    </w:p>
-    <w:p>
-      <w:pPr>
-        <w:spacing w:after="0"/>
-        <w:rPr>
-          <w:rFonts w:ascii="TH SarabunPSK" w:hAnsi="TH SarabunPSK" w:cs="TH SarabunPSK"/>
-          <w:sz w:val="36"/>
-          <w:szCs w:val="36"/>
-        </w:rPr>
-      </w:pPr>
-    </w:p>
-    <w:p>
-      <w:pPr>
-        <w:spacing w:after="0"/>
-        <w:rPr>
-          <w:rFonts w:ascii="TH SarabunPSK" w:hAnsi="TH SarabunPSK" w:cs="TH SarabunPSK"/>
-          <w:sz w:val="36"/>
-          <w:szCs w:val="36"/>
-        </w:rPr>
-      </w:pPr>
-    </w:p>
-    <w:p>
-      <w:pPr>
-        <w:spacing w:after="0"/>
-        <w:rPr>
-          <w:rFonts w:ascii="TH SarabunPSK" w:hAnsi="TH SarabunPSK" w:cs="TH SarabunPSK"/>
-          <w:b/>
-          <w:bCs/>
-          <w:sz w:val="36"/>
-          <w:szCs w:val="36"/>
-        </w:rPr>
-      </w:pPr>
-    </w:p>
-    <w:p>
-      <w:pPr>
-        <w:numPr>
-          <w:ilvl w:val="0"/>
-          <w:numId w:val="2"/>
-        </w:numPr>
-        <w:spacing w:after="0"/>
-        <w:rPr>
-          <w:rFonts w:ascii="TH SarabunPSK" w:hAnsi="TH SarabunPSK" w:cs="TH SarabunPSK"/>
-          <w:sz w:val="32"/>
-          <w:szCs w:val="32"/>
-        </w:rPr>
-      </w:pPr>
-      <w:r>
-        <w:rPr>
-          <w:rFonts w:ascii="TH SarabunPSK" w:hAnsi="TH SarabunPSK" w:cs="TH SarabunPSK"/>
-          <w:b/>
-          <w:bCs/>
-          <w:sz w:val="32"/>
-          <w:szCs w:val="32"/>
-        </w:rPr>
-        <w:t xml:space="preserve">Response (200 OK): </w:t>
-      </w:r>
-    </w:p>
-    <w:p>
-      <w:pPr>
-        <w:pStyle w:val="ListParagraph"/>
-        <w:spacing w:after="0"/>
-        <w:rPr>
-          <w:rFonts w:ascii="TH SarabunPSK" w:hAnsi="TH SarabunPSK" w:cs="TH SarabunPSK"/>
-          <w:sz w:val="36"/>
-          <w:szCs w:val="36"/>
-        </w:rPr>
-      </w:pPr>
-      <w:r>
-        <w:rPr>
-          <w:noProof/>
-        </w:rPr>
-        <mc:AlternateContent>
-          <mc:Choice Requires="wps">
-            <w:drawing>
-              <wp:anchor distT="0" distB="0" distL="114300" distR="114300" simplePos="0" relativeHeight="251811840" behindDoc="0" locked="0" layoutInCell="1" allowOverlap="1" wp14:anchorId="6CC15EBE" wp14:editId="4449795F">
-                <wp:simplePos x="0" y="0"/>
-                <wp:positionH relativeFrom="margin">
-                  <wp:align>right</wp:align>
-                </wp:positionH>
-                <wp:positionV relativeFrom="paragraph">
-                  <wp:posOffset>27940</wp:posOffset>
-                </wp:positionV>
-                <wp:extent cx="5925820" cy="1534601"/>
-                <wp:effectExtent l="0" t="0" r="17780" b="27940"/>
-                <wp:wrapNone/>
-                <wp:docPr id="1309277642" name="Rectangle 2"/>
-                <wp:cNvGraphicFramePr>
-                  <a:graphicFrameLocks xmlns:a="http://schemas.openxmlformats.org/drawingml/2006/main"/>
-                </wp:cNvGraphicFramePr>
-                <a:graphic xmlns:a="http://schemas.openxmlformats.org/drawingml/2006/main">
-                  <a:graphicData uri="http://schemas.microsoft.com/office/word/2010/wordprocessingShape">
-                    <wps:wsp>
-                      <wps:cNvSpPr>
-                        <a:spLocks noChangeArrowheads="1"/>
-                      </wps:cNvSpPr>
-                      <wps:spPr bwMode="auto">
-                        <a:xfrm>
-                          <a:off x="0" y="0"/>
-                          <a:ext cx="5925820" cy="1534601"/>
-                        </a:xfrm>
-                        <a:prstGeom prst="rect">
-                          <a:avLst/>
-                        </a:prstGeom>
-                        <a:solidFill>
-                          <a:schemeClr val="bg1">
-                            <a:lumMod val="85000"/>
-                            <a:lumOff val="0"/>
-                          </a:schemeClr>
-                        </a:solidFill>
-                        <a:ln w="9525">
-                          <a:solidFill>
-                            <a:srgbClr val="000000"/>
-                          </a:solidFill>
-                          <a:miter lim="800000"/>
-                          <a:headEnd/>
-                          <a:tailEnd/>
-                        </a:ln>
-                      </wps:spPr>
-                      <wps:bodyPr rot="0" vert="horz" wrap="square" lIns="91440" tIns="45720" rIns="91440" bIns="45720" anchor="t" anchorCtr="0" upright="1">
-                        <a:noAutofit/>
-                      </wps:bodyPr>
-                    </wps:wsp>
-                  </a:graphicData>
-                </a:graphic>
-                <wp14:sizeRelH relativeFrom="page">
-                  <wp14:pctWidth>0</wp14:pctWidth>
-                </wp14:sizeRelH>
-                <wp14:sizeRelV relativeFrom="page">
-                  <wp14:pctHeight>0</wp14:pctHeight>
-                </wp14:sizeRelV>
-              </wp:anchor>
-            </w:drawing>
-          </mc:Choice>
-          <mc:Fallback>
-            <w:pict>
-              <v:rect w14:anchorId="6481A7EC" id="Rectangle 2" o:spid="_x0000_s1026" style="position:absolute;margin-left:415.4pt;margin-top:2.2pt;width:466.6pt;height:120.85pt;z-index:251811840;visibility:visible;mso-wrap-style:square;mso-width-percent:0;mso-height-percent:0;mso-wrap-distance-left:9pt;mso-wrap-distance-top:0;mso-wrap-distance-right:9pt;mso-wrap-distance-bottom:0;mso-position-horizontal:right;mso-position-horizontal-relative:margin;mso-position-vertical:absolute;mso-position-vertical-relative:text;mso-width-percent:0;mso-height-percent:0;mso-width-relative:page;mso-height-relative:page;v-text-anchor:top" o:gfxdata="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" fillcolor="#d8d8d8 [2732]">
-                <w10:wrap anchorx="margin"/>
-              </v:rect>
-            </w:pict>
-          </mc:Fallback>
-        </mc:AlternateContent>
-      </w:r>
-      <w:r>
-        <w:rPr>
-          <w:noProof/>
-        </w:rPr>
-        <mc:AlternateContent>
-          <mc:Choice Requires="wps">
-            <w:drawing>
-              <wp:anchor distT="0" distB="0" distL="114300" distR="114300" simplePos="0" relativeHeight="251812864" behindDoc="0" locked="0" layoutInCell="1" allowOverlap="1" wp14:anchorId="698343BF" wp14:editId="5DEF0DA4">
-                <wp:simplePos x="0" y="0"/>
-                <wp:positionH relativeFrom="column">
-                  <wp:posOffset>174929</wp:posOffset>
-                </wp:positionH>
-                <wp:positionV relativeFrom="paragraph">
-                  <wp:posOffset>137106</wp:posOffset>
-                </wp:positionV>
-                <wp:extent cx="5591810" cy="1463040"/>
-                <wp:effectExtent l="0" t="0" r="0" b="3810"/>
-                <wp:wrapNone/>
-                <wp:docPr id="665358271" name="Text Box 3"/>
-                <wp:cNvGraphicFramePr>
-                  <a:graphicFrameLocks xmlns:a="http://schemas.openxmlformats.org/drawingml/2006/main"/>
-                </wp:cNvGraphicFramePr>
-                <a:graphic xmlns:a="http://schemas.openxmlformats.org/drawingml/2006/main">
-                  <a:graphicData uri="http://schemas.microsoft.com/office/word/2010/wordprocessingShape">
-                    <wps:wsp>
-                      <wps:cNvSpPr txBox="1">
-                        <a:spLocks noChangeArrowheads="1"/>
-                      </wps:cNvSpPr>
-                      <wps:spPr bwMode="auto">
-                        <a:xfrm>
-                          <a:off x="0" y="0"/>
-                          <a:ext cx="5591810" cy="1463040"/>
-                        </a:xfrm>
-                        <a:prstGeom prst="rect">
-                          <a:avLst/>
-                        </a:prstGeom>
-                        <a:noFill/>
-                        <a:ln>
-                          <a:noFill/>
-                        </a:ln>
-                        <a:extLst>
-                          <a:ext uri="{909E8E84-426E-40DD-AFC4-6F175D3DCCD1}">
-                            <a14:hiddenFill xmlns:a14="http://schemas.microsoft.com/office/drawing/2010/main">
-                              <a:solidFill>
-                                <a:srgbClr val="FFFFFF"/>
-                              </a:solidFill>
-                            </a14:hiddenFill>
-                          </a:ext>
-                          <a:ext uri="{91240B29-F687-4F45-9708-019B960494DF}">
-                            <a14:hiddenLine xmlns:a14="http://schemas.microsoft.com/office/drawing/2010/main" w="9525">
-                              <a:solidFill>
-                                <a:srgbClr val="000000"/>
-                              </a:solidFill>
-                              <a:miter lim="800000"/>
-                              <a:headEnd/>
-                              <a:tailEnd/>
-                            </a14:hiddenLine>
-                          </a:ext>
-                        </a:extLst>
-                      </wps:spPr>
-                      <wps:txbx>
-                        <w:txbxContent>
-                          <w:p>
-                            <w:pPr>
-                              <w:spacing w:after="0"/>
-                            </w:pPr>
-                            <w:r>
-                              <w:t>{</w:t>
-                            </w:r>
-                          </w:p>
-                          <w:p>
-                            <w:pPr>
-                              <w:spacing w:after="0"/>
-                            </w:pPr>
-                            <w:r>
-                              <w:t xml:space="preserve">  "success": true,</w:t>
-                            </w:r>
-                          </w:p>
-                          <w:p>
-                            <w:pPr>
-                              <w:spacing w:after="0"/>
-                            </w:pPr>
-                            <w:r>
-                              <w:t xml:space="preserve">  "message": "reflection created successfully",</w:t>
-                            </w:r>
-                          </w:p>
-                          <w:p>
-                            <w:pPr>
-                              <w:spacing w:after="0"/>
-                            </w:pPr>
-                            <w:r>
-                              <w:t xml:space="preserve">  "data": {</w:t>
-                            </w:r>
-                          </w:p>
-                          <w:p>
-                            <w:pPr>
-                              <w:spacing w:after="0"/>
-                            </w:pPr>
-                            <w:r>
-                              <w:t xml:space="preserve">    "</w:t>
-                            </w:r>
-                            <w:proofErr w:type="spellStart"/>
-                            <w:proofErr w:type="gramStart"/>
-                            <w:r>
-                              <w:t>reflect</w:t>
-                            </w:r>
-                            <w:proofErr w:type="gramEnd"/>
-                            <w:r>
-                              <w:t>_id</w:t>
-                            </w:r>
-                            <w:proofErr w:type="spellEnd"/>
-                            <w:r>
-                              <w:t>": "</w:t>
-                            </w:r>
-                            <w:proofErr w:type="spellStart"/>
-                            <w:r>
-                              <w:t>uuid</w:t>
-                            </w:r>
-                            <w:proofErr w:type="spellEnd"/>
-                            <w:r>
-                              <w:t>"</w:t>
-                            </w:r>
-                          </w:p>
-                          <w:p>
-                            <w:pPr>
-                              <w:spacing w:after="0"/>
-                            </w:pPr>
-                            <w:r>
-                              <w:t xml:space="preserve">  }</w:t>
-                            </w:r>
-                          </w:p>
-                          <w:p>
-                            <w:pPr>
-                              <w:spacing w:after="0"/>
-                            </w:pPr>
-                            <w:r>
-                              <w:t>}</w:t>
-                            </w:r>
-                          </w:p>
-                        </w:txbxContent>
-                      </wps:txbx>
-                      <wps:bodyPr rot="0" vert="horz" wrap="square" lIns="91440" tIns="45720" rIns="91440" bIns="45720" anchor="t" anchorCtr="0" upright="1">
-                        <a:noAutofit/>
-                      </wps:bodyPr>
-                    </wps:wsp>
-                  </a:graphicData>
-                </a:graphic>
-                <wp14:sizeRelH relativeFrom="page">
-                  <wp14:pctWidth>0</wp14:pctWidth>
-                </wp14:sizeRelH>
-                <wp14:sizeRelV relativeFrom="page">
-                  <wp14:pctHeight>0</wp14:pctHeight>
-                </wp14:sizeRelV>
-              </wp:anchor>
-            </w:drawing>
-          </mc:Choice>
-          <mc:Fallback>
-            <w:pict>
-              <v:shape w14:anchorId="698343BF" id="_x0000_s1068" type="#_x0000_t202" style="position:absolute;left:0;text-align:left;margin-left:13.75pt;margin-top:10.8pt;width:440.3pt;height:115.2pt;z-index:251812864;visibility:visible;mso-wrap-style:square;mso-width-percent:0;mso-height-percent:0;mso-wrap-distance-left:9pt;mso-wrap-distance-top:0;mso-wrap-distance-right:9pt;mso-wrap-distance-bottom:0;mso-position-horizontal:absolute;mso-position-horizontal-relative:text;mso-position-vertical:absolute;mso-position-vertical-relative:text;mso-width-percent:0;mso-height-percent:0;mso-width-relative:page;mso-height-relative:page;v-text-anchor:top" o:gfxdata="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" filled="f" stroked="f">
-                <v:textbox>
-                  <w:txbxContent>
-                    <w:p>
-                      <w:pPr>
-                        <w:spacing w:after="0"/>
-                      </w:pPr>
-                      <w:r>
-                        <w:t>{</w:t>
-                      </w:r>
-                    </w:p>
-                    <w:p>
-                      <w:pPr>
-                        <w:spacing w:after="0"/>
-                      </w:pPr>
-                      <w:r>
-                        <w:t xml:space="preserve">  "success": true,</w:t>
-                      </w:r>
-                    </w:p>
-                    <w:p>
-                      <w:pPr>
-                        <w:spacing w:after="0"/>
-                      </w:pPr>
-                      <w:r>
-                        <w:t xml:space="preserve">  "message": "reflection created successfully",</w:t>
-                      </w:r>
-                    </w:p>
-                    <w:p>
-                      <w:pPr>
-                        <w:spacing w:after="0"/>
-                      </w:pPr>
-                      <w:r>
-                        <w:t xml:space="preserve">  "data": {</w:t>
-                      </w:r>
-                    </w:p>
-                    <w:p>
-                      <w:pPr>
-                        <w:spacing w:after="0"/>
-                      </w:pPr>
-                      <w:r>
-                        <w:t xml:space="preserve">    "</w:t>
-                      </w:r>
-                      <w:proofErr w:type="spellStart"/>
-                      <w:proofErr w:type="gramStart"/>
-                      <w:r>
-                        <w:t>reflect</w:t>
-                      </w:r>
-                      <w:proofErr w:type="gramEnd"/>
-                      <w:r>
-                        <w:t>_id</w:t>
-                      </w:r>
-                      <w:proofErr w:type="spellEnd"/>
-                      <w:r>
-                        <w:t>": "</w:t>
-                      </w:r>
-                      <w:proofErr w:type="spellStart"/>
-                      <w:r>
-                        <w:t>uuid</w:t>
-                      </w:r>
-                      <w:proofErr w:type="spellEnd"/>
-                      <w:r>
-                        <w:t>"</w:t>
-                      </w:r>
-                    </w:p>
-                    <w:p>
-                      <w:pPr>
-                        <w:spacing w:after="0"/>
-                      </w:pPr>
-                      <w:r>
-                        <w:t xml:space="preserve">  }</w:t>
-                      </w:r>
-                    </w:p>
-                    <w:p>
-                      <w:pPr>
-                        <w:spacing w:after="0"/>
-                      </w:pPr>
-                      <w:r>
-                        <w:t>}</w:t>
-                      </w:r>
-                    </w:p>
-                  </w:txbxContent>
-                </v:textbox>
-              </v:shape>
-            </w:pict>
-          </mc:Fallback>
-        </mc:AlternateContent>
-      </w:r>
-    </w:p>
-    <w:p>
-      <w:pPr>
-        <w:spacing w:after="0"/>
-        <w:rPr>
-          <w:rFonts w:ascii="TH SarabunPSK" w:hAnsi="TH SarabunPSK" w:cs="TH SarabunPSK"/>
-          <w:sz w:val="36"/>
-          <w:szCs w:val="36"/>
-        </w:rPr>
-      </w:pPr>
-    </w:p>
-    <w:p>
-      <w:pPr>
-        <w:spacing w:after="0"/>
-        <w:ind w:left="360"/>
-        <w:rPr>
-          <w:rFonts w:ascii="TH SarabunPSK" w:hAnsi="TH SarabunPSK" w:cs="TH SarabunPSK"/>
-          <w:sz w:val="36"/>
-          <w:szCs w:val="36"/>
-        </w:rPr>
-      </w:pPr>
-    </w:p>
-    <w:p>
-      <w:pPr>
-        <w:spacing w:after="0"/>
-        <w:rPr>
-          <w:rFonts w:ascii="TH SarabunPSK" w:hAnsi="TH SarabunPSK" w:cs="TH SarabunPSK"/>
-          <w:sz w:val="32"/>
-          <w:szCs w:val="32"/>
-        </w:rPr>
-      </w:pPr>
-    </w:p>
-    <w:p>
-      <w:pPr>
-        <w:spacing w:after="0"/>
-        <w:rPr>
-          <w:rFonts w:ascii="TH SarabunPSK" w:hAnsi="TH SarabunPSK" w:cs="TH SarabunPSK"/>
-          <w:sz w:val="36"/>
-          <w:szCs w:val="36"/>
-        </w:rPr>
-      </w:pPr>
-    </w:p>
-    <w:p>
-      <w:pPr>
-        <w:spacing w:after="0"/>
-        <w:rPr>
-          <w:rFonts w:ascii="TH SarabunPSK" w:hAnsi="TH SarabunPSK" w:cs="TH SarabunPSK"/>
-          <w:sz w:val="36"/>
-          <w:szCs w:val="36"/>
-        </w:rPr>
-      </w:pPr>
-    </w:p>
-    <w:p>
-      <w:pPr>
-        <w:spacing w:after="0"/>
-        <w:rPr>
-          <w:rFonts w:ascii="TH SarabunPSK" w:hAnsi="TH SarabunPSK" w:cs="TH SarabunPSK"/>
-          <w:sz w:val="36"/>
-          <w:szCs w:val="36"/>
-        </w:rPr>
-      </w:pPr>
-    </w:p>
-    <w:p>
-      <w:pPr>
-        <w:spacing w:after="0"/>
-        <w:rPr>
-          <w:rFonts w:ascii="TH SarabunPSK" w:hAnsi="TH SarabunPSK" w:cs="TH SarabunPSK"/>
-          <w:b/>
-          <w:bCs/>
-          <w:sz w:val="36"/>
-          <w:szCs w:val="36"/>
-        </w:rPr>
-      </w:pPr>
-    </w:p>
-    <w:p>
-      <w:pPr>
-        <w:spacing w:after="0"/>
-        <w:rPr>
-          <w:rFonts w:ascii="TH SarabunPSK" w:hAnsi="TH SarabunPSK" w:cs="TH SarabunPSK"/>
-          <w:b/>
-          <w:bCs/>
-          <w:sz w:val="36"/>
-          <w:szCs w:val="36"/>
-        </w:rPr>
-      </w:pPr>
-    </w:p>
-    <w:p>
-      <w:pPr>
-        <w:spacing w:after="0"/>
-        <w:rPr>
-          <w:rFonts w:ascii="TH SarabunPSK" w:hAnsi="TH SarabunPSK" w:cs="TH SarabunPSK"/>
-          <w:b/>
-          <w:bCs/>
-          <w:sz w:val="32"/>
-          <w:szCs w:val="32"/>
-        </w:rPr>
-      </w:pPr>
-      <w:r>
-        <w:rPr>
-          <w:rFonts w:ascii="TH SarabunPSK" w:hAnsi="TH SarabunPSK" w:cs="TH SarabunPSK"/>
-          <w:b/>
-          <w:bCs/>
-          <w:sz w:val="32"/>
-          <w:szCs w:val="32"/>
-        </w:rPr>
-        <w:t>Edit Reflection</w:t>
-      </w:r>
-    </w:p>
-    <w:p>
-      <w:pPr>
-        <w:spacing w:after="0"/>
-        <w:rPr>
-          <w:rFonts w:ascii="TH SarabunPSK" w:hAnsi="TH SarabunPSK" w:cs="TH SarabunPSK"/>
-          <w:sz w:val="32"/>
-          <w:szCs w:val="32"/>
-        </w:rPr>
-      </w:pPr>
-      <w:proofErr w:type="gramStart"/>
-      <w:r>
-        <w:rPr>
-          <w:rFonts w:ascii="TH SarabunPSK" w:hAnsi="TH SarabunPSK" w:cs="TH SarabunPSK"/>
-          <w:b/>
-          <w:bCs/>
-          <w:sz w:val="32"/>
-          <w:szCs w:val="32"/>
-        </w:rPr>
-        <w:lastRenderedPageBreak/>
-        <w:t>Port :</w:t>
-      </w:r>
-      <w:proofErr w:type="gramEnd"/>
-      <w:r>
-        <w:rPr>
-          <w:rFonts w:ascii="TH SarabunPSK" w:hAnsi="TH SarabunPSK" w:cs="TH SarabunPSK"/>
-          <w:b/>
-          <w:bCs/>
-          <w:sz w:val="32"/>
-          <w:szCs w:val="32"/>
-        </w:rPr>
-        <w:t xml:space="preserve"> </w:t>
-      </w:r>
-      <w:r>
-        <w:rPr>
-          <w:rFonts w:ascii="TH SarabunPSK" w:hAnsi="TH SarabunPSK" w:cs="TH SarabunPSK"/>
-          <w:b/>
-          <w:bCs/>
-          <w:sz w:val="32"/>
-          <w:szCs w:val="32"/>
-        </w:rPr>
-        <w:t>5</w:t>
-      </w:r>
-      <w:r>
-        <w:rPr>
-          <w:rFonts w:ascii="TH SarabunPSK" w:hAnsi="TH SarabunPSK" w:cs="TH SarabunPSK"/>
-          <w:b/>
-          <w:bCs/>
-          <w:sz w:val="32"/>
-          <w:szCs w:val="32"/>
-        </w:rPr>
-        <w:t>000</w:t>
-      </w:r>
-    </w:p>
-    <w:p>
-      <w:pPr>
-        <w:numPr>
-          <w:ilvl w:val="0"/>
-          <w:numId w:val="2"/>
-        </w:numPr>
-        <w:spacing w:after="0"/>
-        <w:rPr>
-          <w:rFonts w:ascii="TH SarabunPSK" w:hAnsi="TH SarabunPSK" w:cs="TH SarabunPSK"/>
-          <w:sz w:val="32"/>
-          <w:szCs w:val="32"/>
-        </w:rPr>
-      </w:pPr>
-      <w:r>
-        <w:rPr>
-          <w:rFonts w:ascii="TH SarabunPSK" w:hAnsi="TH SarabunPSK" w:cs="TH SarabunPSK"/>
-          <w:b/>
-          <w:bCs/>
-          <w:sz w:val="32"/>
-          <w:szCs w:val="32"/>
-        </w:rPr>
-        <w:t>URL:</w:t>
-      </w:r>
-      <w:r>
-        <w:rPr>
-          <w:rFonts w:ascii="TH SarabunPSK" w:hAnsi="TH SarabunPSK" w:cs="TH SarabunPSK"/>
-          <w:sz w:val="32"/>
-          <w:szCs w:val="32"/>
-        </w:rPr>
-        <w:t> </w:t>
-      </w:r>
-      <w:r>
-        <w:rPr>
-          <w:rFonts w:ascii="TH SarabunPSK" w:hAnsi="TH SarabunPSK" w:cs="TH SarabunPSK"/>
-          <w:sz w:val="32"/>
-          <w:szCs w:val="32"/>
-        </w:rPr>
-        <w:t>/</w:t>
-      </w:r>
-      <w:proofErr w:type="spellStart"/>
-      <w:r>
-        <w:rPr>
-          <w:rFonts w:ascii="TH SarabunPSK" w:hAnsi="TH SarabunPSK" w:cs="TH SarabunPSK"/>
-          <w:sz w:val="32"/>
-          <w:szCs w:val="32"/>
-        </w:rPr>
-        <w:t>api</w:t>
-      </w:r>
-      <w:proofErr w:type="spellEnd"/>
-      <w:r>
-        <w:rPr>
-          <w:rFonts w:ascii="TH SarabunPSK" w:hAnsi="TH SarabunPSK" w:cs="TH SarabunPSK"/>
-          <w:sz w:val="32"/>
-          <w:szCs w:val="32"/>
-        </w:rPr>
-        <w:t>/v1/</w:t>
-      </w:r>
-      <w:proofErr w:type="gramStart"/>
-      <w:r>
-        <w:rPr>
-          <w:rFonts w:ascii="TH SarabunPSK" w:hAnsi="TH SarabunPSK" w:cs="TH SarabunPSK"/>
-          <w:sz w:val="32"/>
-          <w:szCs w:val="32"/>
-        </w:rPr>
-        <w:t>reflections/</w:t>
-      </w:r>
-      <w:r>
-        <w:rPr>
-          <w:rFonts w:ascii="TH SarabunPSK" w:hAnsi="TH SarabunPSK" w:cs="TH SarabunPSK"/>
-          <w:sz w:val="32"/>
-          <w:szCs w:val="32"/>
-        </w:rPr>
-        <w:t>{</w:t>
-      </w:r>
-      <w:proofErr w:type="spellStart"/>
-      <w:proofErr w:type="gramEnd"/>
-      <w:r>
-        <w:rPr>
-          <w:rFonts w:ascii="TH SarabunPSK" w:hAnsi="TH SarabunPSK" w:cs="TH SarabunPSK"/>
-          <w:sz w:val="32"/>
-          <w:szCs w:val="32"/>
-        </w:rPr>
-        <w:t>reflect_id</w:t>
-      </w:r>
-      <w:proofErr w:type="spellEnd"/>
-      <w:r>
-        <w:rPr>
-          <w:rFonts w:ascii="TH SarabunPSK" w:hAnsi="TH SarabunPSK" w:cs="TH SarabunPSK"/>
-          <w:sz w:val="32"/>
-          <w:szCs w:val="32"/>
-        </w:rPr>
-        <w:t>}</w:t>
-      </w:r>
-    </w:p>
-    <w:p>
-      <w:pPr>
-        <w:numPr>
-          <w:ilvl w:val="0"/>
-          <w:numId w:val="2"/>
-        </w:numPr>
-        <w:spacing w:after="0"/>
-        <w:rPr>
-          <w:rFonts w:ascii="TH SarabunPSK" w:hAnsi="TH SarabunPSK" w:cs="TH SarabunPSK"/>
-          <w:sz w:val="32"/>
-          <w:szCs w:val="32"/>
-        </w:rPr>
-      </w:pPr>
-      <w:r>
-        <w:rPr>
-          <w:rFonts w:ascii="TH SarabunPSK" w:hAnsi="TH SarabunPSK" w:cs="TH SarabunPSK"/>
-          <w:b/>
-          <w:bCs/>
-          <w:sz w:val="32"/>
-          <w:szCs w:val="32"/>
-        </w:rPr>
-        <w:t>Method</w:t>
-      </w:r>
-      <w:r>
-        <w:rPr>
-          <w:rFonts w:ascii="TH SarabunPSK" w:hAnsi="TH SarabunPSK" w:cs="TH SarabunPSK"/>
-          <w:sz w:val="32"/>
-          <w:szCs w:val="32"/>
-        </w:rPr>
-        <w:t xml:space="preserve">: </w:t>
-      </w:r>
-      <w:r>
-        <w:rPr>
-          <w:rFonts w:ascii="TH SarabunPSK" w:hAnsi="TH SarabunPSK" w:cs="TH SarabunPSK"/>
-          <w:sz w:val="32"/>
-          <w:szCs w:val="32"/>
-        </w:rPr>
-        <w:t>PUT</w:t>
-      </w:r>
-    </w:p>
-    <w:p>
-      <w:pPr>
-        <w:numPr>
-          <w:ilvl w:val="0"/>
-          <w:numId w:val="2"/>
-        </w:numPr>
-        <w:spacing w:after="0"/>
-        <w:rPr>
-          <w:rFonts w:ascii="TH SarabunPSK" w:hAnsi="TH SarabunPSK" w:cs="TH SarabunPSK"/>
-          <w:sz w:val="32"/>
-          <w:szCs w:val="32"/>
-        </w:rPr>
-      </w:pPr>
-      <w:r>
-        <w:rPr>
-          <w:rFonts w:ascii="TH SarabunPSK" w:hAnsi="TH SarabunPSK" w:cs="TH SarabunPSK"/>
-          <w:b/>
-          <w:bCs/>
-          <w:sz w:val="32"/>
-          <w:szCs w:val="32"/>
-        </w:rPr>
-        <w:t xml:space="preserve">Description: </w:t>
-      </w:r>
-      <w:proofErr w:type="spellStart"/>
-      <w:r>
-        <w:rPr>
-          <w:rFonts w:ascii="TH SarabunPSK" w:hAnsi="TH SarabunPSK" w:cs="TH SarabunPSK"/>
-          <w:sz w:val="32"/>
-          <w:szCs w:val="32"/>
-          <w:cs/>
-        </w:rPr>
-        <w:t>อัป</w:t>
-      </w:r>
-      <w:proofErr w:type="spellEnd"/>
-      <w:r>
-        <w:rPr>
-          <w:rFonts w:ascii="TH SarabunPSK" w:hAnsi="TH SarabunPSK" w:cs="TH SarabunPSK"/>
-          <w:sz w:val="32"/>
-          <w:szCs w:val="32"/>
-          <w:cs/>
-        </w:rPr>
-        <w:t>เดตข้อมูลบันทึกการเรียนรู้ที่เคยบันทึกไว้ เช่น เปลี่ยนแปลงเนื้อหา คะแนนความรู้สึก ความท้าทาย ความก้าวหน้า หรือเพิ่มมูดและแท็กเพิ่มเติม ให้ผู้ใช้สามารถแก้ไขข้อมูลการเรียนรู้ของตนเองได้</w:t>
-      </w:r>
-    </w:p>
-    <w:p>
-      <w:pPr>
-        <w:numPr>
-          <w:ilvl w:val="0"/>
-          <w:numId w:val="2"/>
-        </w:numPr>
-        <w:spacing w:after="0"/>
-        <w:rPr>
-          <w:rFonts w:ascii="TH SarabunPSK" w:hAnsi="TH SarabunPSK" w:cs="TH SarabunPSK"/>
-          <w:sz w:val="32"/>
-          <w:szCs w:val="32"/>
-        </w:rPr>
-      </w:pPr>
-      <w:r>
-        <w:rPr>
-          <w:rFonts w:ascii="TH SarabunPSK" w:hAnsi="TH SarabunPSK" w:cs="TH SarabunPSK"/>
-          <w:b/>
-          <w:bCs/>
-          <w:sz w:val="32"/>
-          <w:szCs w:val="32"/>
-        </w:rPr>
-        <w:t xml:space="preserve">Request body: </w:t>
-      </w:r>
-    </w:p>
-    <w:p>
-      <w:pPr>
-        <w:pStyle w:val="ListParagraph"/>
-        <w:spacing w:after="0"/>
-        <w:rPr>
-          <w:rFonts w:ascii="TH SarabunPSK" w:hAnsi="TH SarabunPSK" w:cs="TH SarabunPSK"/>
-          <w:sz w:val="36"/>
-          <w:szCs w:val="36"/>
-        </w:rPr>
-      </w:pPr>
-      <w:r>
-        <w:rPr>
-          <w:noProof/>
-        </w:rPr>
-        <mc:AlternateContent>
-          <mc:Choice Requires="wps">
-            <w:drawing>
-              <wp:anchor distT="0" distB="0" distL="114300" distR="114300" simplePos="0" relativeHeight="251814912" behindDoc="0" locked="0" layoutInCell="1" allowOverlap="1" wp14:anchorId="367312BF" wp14:editId="249AC9C5">
+              <wp:anchor distT="0" distB="0" distL="114300" distR="114300" simplePos="0" relativeHeight="251808768" behindDoc="0" locked="0" layoutInCell="1" allowOverlap="1" wp14:anchorId="42818DF8" wp14:editId="2866E760">
                 <wp:simplePos x="0" y="0"/>
                 <wp:positionH relativeFrom="margin">
                   <wp:align>right</wp:align>
@@ -33803,7 +32490,7 @@
                 <wp:extent cx="5925820" cy="1876508"/>
                 <wp:effectExtent l="0" t="0" r="17780" b="28575"/>
                 <wp:wrapNone/>
-                <wp:docPr id="1137259202" name="Rectangle 2"/>
+                <wp:docPr id="829724434" name="Rectangle 2"/>
                 <wp:cNvGraphicFramePr>
                   <a:graphicFrameLocks xmlns:a="http://schemas.openxmlformats.org/drawingml/2006/main"/>
                 </wp:cNvGraphicFramePr>
@@ -33853,7 +32540,7 @@
           </mc:Choice>
           <mc:Fallback>
             <w:pict>
-              <v:rect w14:anchorId="417226AE" id="Rectangle 2" o:spid="_x0000_s1026" style="position:absolute;margin-left:415.4pt;margin-top:2.2pt;width:466.6pt;height:147.75pt;z-index:251814912;visibility:visible;mso-wrap-style:square;mso-width-percent:0;mso-height-percent:0;mso-wrap-distance-left:9pt;mso-wrap-distance-top:0;mso-wrap-distance-right:9pt;mso-wrap-distance-bottom:0;mso-position-horizontal:right;mso-position-horizontal-relative:margin;mso-position-vertical:absolute;mso-position-vertical-relative:text;mso-width-percent:0;mso-height-percent:0;mso-width-relative:page;mso-height-relative:page;v-text-anchor:top" o:gfxdata="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" fillcolor="#d8d8d8 [2732]">
+              <v:rect w14:anchorId="10E4B96C" id="Rectangle 2" o:spid="_x0000_s1026" style="position:absolute;margin-left:415.4pt;margin-top:2.2pt;width:466.6pt;height:147.75pt;z-index:251808768;visibility:visible;mso-wrap-style:square;mso-width-percent:0;mso-height-percent:0;mso-wrap-distance-left:9pt;mso-wrap-distance-top:0;mso-wrap-distance-right:9pt;mso-wrap-distance-bottom:0;mso-position-horizontal:right;mso-position-horizontal-relative:margin;mso-position-vertical:absolute;mso-position-vertical-relative:text;mso-width-percent:0;mso-height-percent:0;mso-width-relative:page;mso-height-relative:page;v-text-anchor:top" o:gfxdata="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" fillcolor="#d8d8d8 [2732]">
                 <w10:wrap anchorx="margin"/>
               </v:rect>
             </w:pict>
@@ -33867,7 +32554,7 @@
         <mc:AlternateContent>
           <mc:Choice Requires="wps">
             <w:drawing>
-              <wp:anchor distT="0" distB="0" distL="114300" distR="114300" simplePos="0" relativeHeight="251815936" behindDoc="0" locked="0" layoutInCell="1" allowOverlap="1" wp14:anchorId="3FB7A82C" wp14:editId="77D8FF96">
+              <wp:anchor distT="0" distB="0" distL="114300" distR="114300" simplePos="0" relativeHeight="251809792" behindDoc="0" locked="0" layoutInCell="1" allowOverlap="1" wp14:anchorId="77931A85" wp14:editId="61F8C6F5">
                 <wp:simplePos x="0" y="0"/>
                 <wp:positionH relativeFrom="column">
                   <wp:posOffset>174929</wp:posOffset>
@@ -33875,10 +32562,10 @@
                 <wp:positionV relativeFrom="paragraph">
                   <wp:posOffset>135034</wp:posOffset>
                 </wp:positionV>
-                <wp:extent cx="5591810" cy="1757238"/>
-                <wp:effectExtent l="0" t="0" r="0" b="0"/>
+                <wp:extent cx="5591810" cy="1789044"/>
+                <wp:effectExtent l="0" t="0" r="0" b="1905"/>
                 <wp:wrapNone/>
-                <wp:docPr id="1974271106" name="Text Box 3"/>
+                <wp:docPr id="110113225" name="Text Box 3"/>
                 <wp:cNvGraphicFramePr>
                   <a:graphicFrameLocks xmlns:a="http://schemas.openxmlformats.org/drawingml/2006/main"/>
                 </wp:cNvGraphicFramePr>
@@ -33891,7 +32578,7 @@
                       <wps:spPr bwMode="auto">
                         <a:xfrm>
                           <a:off x="0" y="0"/>
-                          <a:ext cx="5591810" cy="1757238"/>
+                          <a:ext cx="5591810" cy="1789044"/>
                         </a:xfrm>
                         <a:prstGeom prst="rect">
                           <a:avLst/>
@@ -33935,7 +32622,15 @@
                               <w:spacing w:after="0"/>
                             </w:pPr>
                             <w:r>
-                              <w:t xml:space="preserve">  "learned": "string (required)",</w:t>
+                              <w:t xml:space="preserve">  "learned": "today </w:t>
+                            </w:r>
+                            <w:proofErr w:type="spellStart"/>
+                            <w:r>
+                              <w:t>i</w:t>
+                            </w:r>
+                            <w:proofErr w:type="spellEnd"/>
+                            <w:r>
+                              <w:t xml:space="preserve"> learn python and how to use the library",</w:t>
                             </w:r>
                           </w:p>
                           <w:p>
@@ -33956,15 +32651,31 @@
                             </w:r>
                             <w:proofErr w:type="spellEnd"/>
                             <w:r>
-                              <w:t>": "string (required)",</w:t>
-                            </w:r>
-                          </w:p>
-                          <w:p>
-                            <w:pPr>
-                              <w:spacing w:after="0"/>
-                            </w:pPr>
-                            <w:r>
-                              <w:t xml:space="preserve">  "reflect": "string (required)",</w:t>
+                              <w:t>": "8",</w:t>
+                            </w:r>
+                          </w:p>
+                          <w:p>
+                            <w:pPr>
+                              <w:spacing w:after="0"/>
+                            </w:pPr>
+                            <w:r>
+                              <w:t xml:space="preserve">  "reflect": "this is so fun and </w:t>
+                            </w:r>
+                            <w:proofErr w:type="spellStart"/>
+                            <w:r>
+                              <w:t>i</w:t>
+                            </w:r>
+                            <w:proofErr w:type="spellEnd"/>
+                            <w:r>
+                              <w:t xml:space="preserve"> want to make my knowledge </w:t>
+                            </w:r>
+                            <w:proofErr w:type="spellStart"/>
+                            <w:r>
+                              <w:t>epandation</w:t>
+                            </w:r>
+                            <w:proofErr w:type="spellEnd"/>
+                            <w:r>
+                              <w:t>",</w:t>
                             </w:r>
                           </w:p>
                           <w:p>
@@ -33985,7 +32696,7 @@
                             </w:r>
                             <w:proofErr w:type="spellEnd"/>
                             <w:r>
-                              <w:t>": "string (required)",</w:t>
+                              <w:t>": "7",</w:t>
                             </w:r>
                           </w:p>
                           <w:p>
@@ -34006,23 +32717,36 @@
                             </w:r>
                             <w:proofErr w:type="spellEnd"/>
                             <w:r>
-                              <w:t>": "string (required)",</w:t>
-                            </w:r>
-                          </w:p>
-                          <w:p>
-                            <w:pPr>
-                              <w:spacing w:after="0"/>
-                            </w:pPr>
-                            <w:r>
-                              <w:t xml:space="preserve">  "mood": "string (optional)",</w:t>
-                            </w:r>
-                          </w:p>
-                          <w:p>
-                            <w:pPr>
-                              <w:spacing w:after="0"/>
-                            </w:pPr>
-                            <w:r>
-                              <w:t xml:space="preserve">  "tag": "string (optional)"</w:t>
+                              <w:t>": "3",</w:t>
+                            </w:r>
+                          </w:p>
+                          <w:p>
+                            <w:pPr>
+                              <w:spacing w:after="0"/>
+                            </w:pPr>
+                            <w:r>
+                              <w:t xml:space="preserve">  "mood": "Fun",</w:t>
+                            </w:r>
+                          </w:p>
+                          <w:p>
+                            <w:pPr>
+                              <w:spacing w:after="0"/>
+                            </w:pPr>
+                            <w:r>
+                              <w:t xml:space="preserve">  "</w:t>
+                            </w:r>
+                            <w:proofErr w:type="spellStart"/>
+                            <w:proofErr w:type="gramStart"/>
+                            <w:r>
+                              <w:t>tree</w:t>
+                            </w:r>
+                            <w:proofErr w:type="gramEnd"/>
+                            <w:r>
+                              <w:t>_node_id</w:t>
+                            </w:r>
+                            <w:proofErr w:type="spellEnd"/>
+                            <w:r>
+                              <w:t>": "bbbb2222-cc33-dd44-ee55-ffffffffffff"</w:t>
                             </w:r>
                           </w:p>
                           <w:p>
@@ -34052,7 +32776,7 @@
           </mc:Choice>
           <mc:Fallback>
             <w:pict>
-              <v:shape w14:anchorId="3FB7A82C" id="_x0000_s1069" type="#_x0000_t202" style="position:absolute;left:0;text-align:left;margin-left:13.75pt;margin-top:10.65pt;width:440.3pt;height:138.35pt;z-index:251815936;visibility:visible;mso-wrap-style:square;mso-width-percent:0;mso-height-percent:0;mso-wrap-distance-left:9pt;mso-wrap-distance-top:0;mso-wrap-distance-right:9pt;mso-wrap-distance-bottom:0;mso-position-horizontal:absolute;mso-position-horizontal-relative:text;mso-position-vertical:absolute;mso-position-vertical-relative:text;mso-width-percent:0;mso-height-percent:0;mso-width-relative:page;mso-height-relative:page;v-text-anchor:top" o:gfxdata="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" filled="f" stroked="f">
+              <v:shape w14:anchorId="77931A85" id="_x0000_s1067" type="#_x0000_t202" style="position:absolute;left:0;text-align:left;margin-left:13.75pt;margin-top:10.65pt;width:440.3pt;height:140.85pt;z-index:251809792;visibility:visible;mso-wrap-style:square;mso-width-percent:0;mso-height-percent:0;mso-wrap-distance-left:9pt;mso-wrap-distance-top:0;mso-wrap-distance-right:9pt;mso-wrap-distance-bottom:0;mso-position-horizontal:absolute;mso-position-horizontal-relative:text;mso-position-vertical:absolute;mso-position-vertical-relative:text;mso-width-percent:0;mso-height-percent:0;mso-width-relative:page;mso-height-relative:page;v-text-anchor:top" o:gfxdata="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" filled="f" stroked="f">
                 <v:textbox>
                   <w:txbxContent>
                     <w:p>
@@ -34068,7 +32792,15 @@
                         <w:spacing w:after="0"/>
                       </w:pPr>
                       <w:r>
-                        <w:t xml:space="preserve">  "learned": "string (required)",</w:t>
+                        <w:t xml:space="preserve">  "learned": "today </w:t>
+                      </w:r>
+                      <w:proofErr w:type="spellStart"/>
+                      <w:r>
+                        <w:t>i</w:t>
+                      </w:r>
+                      <w:proofErr w:type="spellEnd"/>
+                      <w:r>
+                        <w:t xml:space="preserve"> learn python and how to use the library",</w:t>
                       </w:r>
                     </w:p>
                     <w:p>
@@ -34089,15 +32821,31 @@
                       </w:r>
                       <w:proofErr w:type="spellEnd"/>
                       <w:r>
-                        <w:t>": "string (required)",</w:t>
-                      </w:r>
-                    </w:p>
-                    <w:p>
-                      <w:pPr>
-                        <w:spacing w:after="0"/>
-                      </w:pPr>
-                      <w:r>
-                        <w:t xml:space="preserve">  "reflect": "string (required)",</w:t>
+                        <w:t>": "8",</w:t>
+                      </w:r>
+                    </w:p>
+                    <w:p>
+                      <w:pPr>
+                        <w:spacing w:after="0"/>
+                      </w:pPr>
+                      <w:r>
+                        <w:t xml:space="preserve">  "reflect": "this is so fun and </w:t>
+                      </w:r>
+                      <w:proofErr w:type="spellStart"/>
+                      <w:r>
+                        <w:t>i</w:t>
+                      </w:r>
+                      <w:proofErr w:type="spellEnd"/>
+                      <w:r>
+                        <w:t xml:space="preserve"> want to make my knowledge </w:t>
+                      </w:r>
+                      <w:proofErr w:type="spellStart"/>
+                      <w:r>
+                        <w:t>epandation</w:t>
+                      </w:r>
+                      <w:proofErr w:type="spellEnd"/>
+                      <w:r>
+                        <w:t>",</w:t>
                       </w:r>
                     </w:p>
                     <w:p>
@@ -34118,7 +32866,7 @@
                       </w:r>
                       <w:proofErr w:type="spellEnd"/>
                       <w:r>
-                        <w:t>": "string (required)",</w:t>
+                        <w:t>": "7",</w:t>
                       </w:r>
                     </w:p>
                     <w:p>
@@ -34139,23 +32887,36 @@
                       </w:r>
                       <w:proofErr w:type="spellEnd"/>
                       <w:r>
-                        <w:t>": "string (required)",</w:t>
-                      </w:r>
-                    </w:p>
-                    <w:p>
-                      <w:pPr>
-                        <w:spacing w:after="0"/>
-                      </w:pPr>
-                      <w:r>
-                        <w:t xml:space="preserve">  "mood": "string (optional)",</w:t>
-                      </w:r>
-                    </w:p>
-                    <w:p>
-                      <w:pPr>
-                        <w:spacing w:after="0"/>
-                      </w:pPr>
-                      <w:r>
-                        <w:t xml:space="preserve">  "tag": "string (optional)"</w:t>
+                        <w:t>": "3",</w:t>
+                      </w:r>
+                    </w:p>
+                    <w:p>
+                      <w:pPr>
+                        <w:spacing w:after="0"/>
+                      </w:pPr>
+                      <w:r>
+                        <w:t xml:space="preserve">  "mood": "Fun",</w:t>
+                      </w:r>
+                    </w:p>
+                    <w:p>
+                      <w:pPr>
+                        <w:spacing w:after="0"/>
+                      </w:pPr>
+                      <w:r>
+                        <w:t xml:space="preserve">  "</w:t>
+                      </w:r>
+                      <w:proofErr w:type="spellStart"/>
+                      <w:proofErr w:type="gramStart"/>
+                      <w:r>
+                        <w:t>tree</w:t>
+                      </w:r>
+                      <w:proofErr w:type="gramEnd"/>
+                      <w:r>
+                        <w:t>_node_id</w:t>
+                      </w:r>
+                      <w:proofErr w:type="spellEnd"/>
+                      <w:r>
+                        <w:t>": "bbbb2222-cc33-dd44-ee55-ffffffffffff"</w:t>
                       </w:r>
                     </w:p>
                     <w:p>
@@ -34278,7 +33039,7 @@
         <mc:AlternateContent>
           <mc:Choice Requires="wps">
             <w:drawing>
-              <wp:anchor distT="0" distB="0" distL="114300" distR="114300" simplePos="0" relativeHeight="251816960" behindDoc="0" locked="0" layoutInCell="1" allowOverlap="1" wp14:anchorId="47AE02CF" wp14:editId="5F7C4181">
+              <wp:anchor distT="0" distB="0" distL="114300" distR="114300" simplePos="0" relativeHeight="251811840" behindDoc="0" locked="0" layoutInCell="1" allowOverlap="1" wp14:anchorId="6CC15EBE" wp14:editId="66BC8927">
                 <wp:simplePos x="0" y="0"/>
                 <wp:positionH relativeFrom="margin">
                   <wp:align>right</wp:align>
@@ -34286,10 +33047,10 @@
                 <wp:positionV relativeFrom="paragraph">
                   <wp:posOffset>27940</wp:posOffset>
                 </wp:positionV>
-                <wp:extent cx="5925820" cy="1614115"/>
-                <wp:effectExtent l="0" t="0" r="17780" b="24765"/>
+                <wp:extent cx="5925820" cy="2631882"/>
+                <wp:effectExtent l="0" t="0" r="17780" b="16510"/>
                 <wp:wrapNone/>
-                <wp:docPr id="2142116076" name="Rectangle 2"/>
+                <wp:docPr id="1309277642" name="Rectangle 2"/>
                 <wp:cNvGraphicFramePr>
                   <a:graphicFrameLocks xmlns:a="http://schemas.openxmlformats.org/drawingml/2006/main"/>
                 </wp:cNvGraphicFramePr>
@@ -34302,7 +33063,7 @@
                       <wps:spPr bwMode="auto">
                         <a:xfrm>
                           <a:off x="0" y="0"/>
-                          <a:ext cx="5925820" cy="1614115"/>
+                          <a:ext cx="5925820" cy="2631882"/>
                         </a:xfrm>
                         <a:prstGeom prst="rect">
                           <a:avLst/>
@@ -34339,7 +33100,7 @@
           </mc:Choice>
           <mc:Fallback>
             <w:pict>
-              <v:rect w14:anchorId="63D8EB5A" id="Rectangle 2" o:spid="_x0000_s1026" style="position:absolute;margin-left:415.4pt;margin-top:2.2pt;width:466.6pt;height:127.1pt;z-index:251816960;visibility:visible;mso-wrap-style:square;mso-width-percent:0;mso-height-percent:0;mso-wrap-distance-left:9pt;mso-wrap-distance-top:0;mso-wrap-distance-right:9pt;mso-wrap-distance-bottom:0;mso-position-horizontal:right;mso-position-horizontal-relative:margin;mso-position-vertical:absolute;mso-position-vertical-relative:text;mso-width-percent:0;mso-height-percent:0;mso-width-relative:page;mso-height-relative:page;v-text-anchor:top" o:gfxdata="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" fillcolor="#d8d8d8 [2732]">
+              <v:rect w14:anchorId="7FFCDEBA" id="Rectangle 2" o:spid="_x0000_s1026" style="position:absolute;margin-left:415.4pt;margin-top:2.2pt;width:466.6pt;height:207.25pt;z-index:251811840;visibility:visible;mso-wrap-style:square;mso-width-percent:0;mso-height-percent:0;mso-wrap-distance-left:9pt;mso-wrap-distance-top:0;mso-wrap-distance-right:9pt;mso-wrap-distance-bottom:0;mso-position-horizontal:right;mso-position-horizontal-relative:margin;mso-position-vertical:absolute;mso-position-vertical-relative:text;mso-width-percent:0;mso-height-percent:0;mso-width-relative:page;mso-height-relative:page;v-text-anchor:top" o:gfxdata="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" fillcolor="#d8d8d8 [2732]">
                 <w10:wrap anchorx="margin"/>
               </v:rect>
             </w:pict>
@@ -34353,18 +33114,18 @@
         <mc:AlternateContent>
           <mc:Choice Requires="wps">
             <w:drawing>
-              <wp:anchor distT="0" distB="0" distL="114300" distR="114300" simplePos="0" relativeHeight="251817984" behindDoc="0" locked="0" layoutInCell="1" allowOverlap="1" wp14:anchorId="3CF5067E" wp14:editId="1F06D8D5">
+              <wp:anchor distT="0" distB="0" distL="114300" distR="114300" simplePos="0" relativeHeight="251812864" behindDoc="0" locked="0" layoutInCell="1" allowOverlap="1" wp14:anchorId="698343BF" wp14:editId="034E9B2D">
                 <wp:simplePos x="0" y="0"/>
                 <wp:positionH relativeFrom="column">
                   <wp:posOffset>174929</wp:posOffset>
                 </wp:positionH>
                 <wp:positionV relativeFrom="paragraph">
-                  <wp:posOffset>137106</wp:posOffset>
+                  <wp:posOffset>133681</wp:posOffset>
                 </wp:positionV>
-                <wp:extent cx="5591810" cy="1463040"/>
-                <wp:effectExtent l="0" t="0" r="0" b="3810"/>
+                <wp:extent cx="5591810" cy="2560320"/>
+                <wp:effectExtent l="0" t="0" r="0" b="0"/>
                 <wp:wrapNone/>
-                <wp:docPr id="692341635" name="Text Box 3"/>
+                <wp:docPr id="665358271" name="Text Box 3"/>
                 <wp:cNvGraphicFramePr>
                   <a:graphicFrameLocks xmlns:a="http://schemas.openxmlformats.org/drawingml/2006/main"/>
                 </wp:cNvGraphicFramePr>
@@ -34377,7 +33138,7 @@
                       <wps:spPr bwMode="auto">
                         <a:xfrm>
                           <a:off x="0" y="0"/>
-                          <a:ext cx="5591810" cy="1463040"/>
+                          <a:ext cx="5591810" cy="2560320"/>
                         </a:xfrm>
                         <a:prstGeom prst="rect">
                           <a:avLst/>
@@ -34421,22 +33182,6 @@
                               <w:spacing w:after="0"/>
                             </w:pPr>
                             <w:r>
-                              <w:t xml:space="preserve">  "success": true,</w:t>
-                            </w:r>
-                          </w:p>
-                          <w:p>
-                            <w:pPr>
-                              <w:spacing w:after="0"/>
-                            </w:pPr>
-                            <w:r>
-                              <w:t xml:space="preserve">  "message": "reflection updated successfully",</w:t>
-                            </w:r>
-                          </w:p>
-                          <w:p>
-                            <w:pPr>
-                              <w:spacing w:after="0"/>
-                            </w:pPr>
-                            <w:r>
                               <w:t xml:space="preserve">  "data": {</w:t>
                             </w:r>
                           </w:p>
@@ -34458,23 +33203,100 @@
                             </w:r>
                             <w:proofErr w:type="spellEnd"/>
                             <w:r>
-                              <w:t>": "</w:t>
+                              <w:t>": {</w:t>
+                            </w:r>
+                          </w:p>
+                          <w:p>
+                            <w:pPr>
+                              <w:spacing w:after="0"/>
+                            </w:pPr>
+                            <w:r>
+                              <w:t xml:space="preserve">      "id": "ead49430-53e8-413d-a37c-3152551a2d9b",</w:t>
+                            </w:r>
+                          </w:p>
+                          <w:p>
+                            <w:pPr>
+                              <w:spacing w:after="0"/>
+                            </w:pPr>
+                            <w:r>
+                              <w:t xml:space="preserve">      "score": "8",</w:t>
+                            </w:r>
+                          </w:p>
+                          <w:p>
+                            <w:pPr>
+                              <w:spacing w:after="0"/>
+                            </w:pPr>
+                            <w:r>
+                              <w:t xml:space="preserve">      "mood": "Positive",</w:t>
+                            </w:r>
+                          </w:p>
+                          <w:p>
+                            <w:pPr>
+                              <w:spacing w:after="0"/>
+                            </w:pPr>
+                            <w:r>
+                              <w:t xml:space="preserve">      "summary": "today </w:t>
                             </w:r>
                             <w:proofErr w:type="spellStart"/>
                             <w:r>
-                              <w:t>uuid</w:t>
+                              <w:t>i</w:t>
                             </w:r>
                             <w:proofErr w:type="spellEnd"/>
                             <w:r>
-                              <w:t>"</w:t>
-                            </w:r>
-                          </w:p>
-                          <w:p>
-                            <w:pPr>
-                              <w:spacing w:after="0"/>
-                            </w:pPr>
-                            <w:r>
-                              <w:t xml:space="preserve">  }</w:t>
+                              <w:t xml:space="preserve"> learn python and how to use the library",</w:t>
+                            </w:r>
+                          </w:p>
+                          <w:p>
+                            <w:pPr>
+                              <w:spacing w:after="0"/>
+                            </w:pPr>
+                            <w:r>
+                              <w:t xml:space="preserve">      "</w:t>
+                            </w:r>
+                            <w:proofErr w:type="spellStart"/>
+                            <w:proofErr w:type="gramStart"/>
+                            <w:r>
+                              <w:t>created</w:t>
+                            </w:r>
+                            <w:proofErr w:type="gramEnd"/>
+                            <w:r>
+                              <w:t>_at</w:t>
+                            </w:r>
+                            <w:proofErr w:type="spellEnd"/>
+                            <w:r>
+                              <w:t>": ""</w:t>
+                            </w:r>
+                          </w:p>
+                          <w:p>
+                            <w:pPr>
+                              <w:spacing w:after="0"/>
+                            </w:pPr>
+                            <w:r>
+                              <w:t xml:space="preserve">    }</w:t>
+                            </w:r>
+                          </w:p>
+                          <w:p>
+                            <w:pPr>
+                              <w:spacing w:after="0"/>
+                            </w:pPr>
+                            <w:r>
+                              <w:t xml:space="preserve">  },</w:t>
+                            </w:r>
+                          </w:p>
+                          <w:p>
+                            <w:pPr>
+                              <w:spacing w:after="0"/>
+                            </w:pPr>
+                            <w:r>
+                              <w:t xml:space="preserve">  "message": "reflection created successfully",</w:t>
+                            </w:r>
+                          </w:p>
+                          <w:p>
+                            <w:pPr>
+                              <w:spacing w:after="0"/>
+                            </w:pPr>
+                            <w:r>
+                              <w:t xml:space="preserve">  "success": true</w:t>
                             </w:r>
                           </w:p>
                           <w:p>
@@ -34504,7 +33326,7 @@
           </mc:Choice>
           <mc:Fallback>
             <w:pict>
-              <v:shape w14:anchorId="3CF5067E" id="_x0000_s1070" type="#_x0000_t202" style="position:absolute;left:0;text-align:left;margin-left:13.75pt;margin-top:10.8pt;width:440.3pt;height:115.2pt;z-index:251817984;visibility:visible;mso-wrap-style:square;mso-width-percent:0;mso-height-percent:0;mso-wrap-distance-left:9pt;mso-wrap-distance-top:0;mso-wrap-distance-right:9pt;mso-wrap-distance-bottom:0;mso-position-horizontal:absolute;mso-position-horizontal-relative:text;mso-position-vertical:absolute;mso-position-vertical-relative:text;mso-width-percent:0;mso-height-percent:0;mso-width-relative:page;mso-height-relative:page;v-text-anchor:top" o:gfxdata="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" filled="f" stroked="f">
+              <v:shape w14:anchorId="698343BF" id="_x0000_s1068" type="#_x0000_t202" style="position:absolute;left:0;text-align:left;margin-left:13.75pt;margin-top:10.55pt;width:440.3pt;height:201.6pt;z-index:251812864;visibility:visible;mso-wrap-style:square;mso-width-percent:0;mso-height-percent:0;mso-wrap-distance-left:9pt;mso-wrap-distance-top:0;mso-wrap-distance-right:9pt;mso-wrap-distance-bottom:0;mso-position-horizontal:absolute;mso-position-horizontal-relative:text;mso-position-vertical:absolute;mso-position-vertical-relative:text;mso-width-percent:0;mso-height-percent:0;mso-width-relative:page;mso-height-relative:page;v-text-anchor:top" o:gfxdata="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" filled="f" stroked="f">
                 <v:textbox>
                   <w:txbxContent>
                     <w:p>
@@ -34520,22 +33342,6 @@
                         <w:spacing w:after="0"/>
                       </w:pPr>
                       <w:r>
-                        <w:t xml:space="preserve">  "success": true,</w:t>
-                      </w:r>
-                    </w:p>
-                    <w:p>
-                      <w:pPr>
-                        <w:spacing w:after="0"/>
-                      </w:pPr>
-                      <w:r>
-                        <w:t xml:space="preserve">  "message": "reflection updated successfully",</w:t>
-                      </w:r>
-                    </w:p>
-                    <w:p>
-                      <w:pPr>
-                        <w:spacing w:after="0"/>
-                      </w:pPr>
-                      <w:r>
                         <w:t xml:space="preserve">  "data": {</w:t>
                       </w:r>
                     </w:p>
@@ -34557,23 +33363,100 @@
                       </w:r>
                       <w:proofErr w:type="spellEnd"/>
                       <w:r>
-                        <w:t>": "</w:t>
+                        <w:t>": {</w:t>
+                      </w:r>
+                    </w:p>
+                    <w:p>
+                      <w:pPr>
+                        <w:spacing w:after="0"/>
+                      </w:pPr>
+                      <w:r>
+                        <w:t xml:space="preserve">      "id": "ead49430-53e8-413d-a37c-3152551a2d9b",</w:t>
+                      </w:r>
+                    </w:p>
+                    <w:p>
+                      <w:pPr>
+                        <w:spacing w:after="0"/>
+                      </w:pPr>
+                      <w:r>
+                        <w:t xml:space="preserve">      "score": "8",</w:t>
+                      </w:r>
+                    </w:p>
+                    <w:p>
+                      <w:pPr>
+                        <w:spacing w:after="0"/>
+                      </w:pPr>
+                      <w:r>
+                        <w:t xml:space="preserve">      "mood": "Positive",</w:t>
+                      </w:r>
+                    </w:p>
+                    <w:p>
+                      <w:pPr>
+                        <w:spacing w:after="0"/>
+                      </w:pPr>
+                      <w:r>
+                        <w:t xml:space="preserve">      "summary": "today </w:t>
                       </w:r>
                       <w:proofErr w:type="spellStart"/>
                       <w:r>
-                        <w:t>uuid</w:t>
+                        <w:t>i</w:t>
                       </w:r>
                       <w:proofErr w:type="spellEnd"/>
                       <w:r>
-                        <w:t>"</w:t>
-                      </w:r>
-                    </w:p>
-                    <w:p>
-                      <w:pPr>
-                        <w:spacing w:after="0"/>
-                      </w:pPr>
-                      <w:r>
-                        <w:t xml:space="preserve">  }</w:t>
+                        <w:t xml:space="preserve"> learn python and how to use the library",</w:t>
+                      </w:r>
+                    </w:p>
+                    <w:p>
+                      <w:pPr>
+                        <w:spacing w:after="0"/>
+                      </w:pPr>
+                      <w:r>
+                        <w:t xml:space="preserve">      "</w:t>
+                      </w:r>
+                      <w:proofErr w:type="spellStart"/>
+                      <w:proofErr w:type="gramStart"/>
+                      <w:r>
+                        <w:t>created</w:t>
+                      </w:r>
+                      <w:proofErr w:type="gramEnd"/>
+                      <w:r>
+                        <w:t>_at</w:t>
+                      </w:r>
+                      <w:proofErr w:type="spellEnd"/>
+                      <w:r>
+                        <w:t>": ""</w:t>
+                      </w:r>
+                    </w:p>
+                    <w:p>
+                      <w:pPr>
+                        <w:spacing w:after="0"/>
+                      </w:pPr>
+                      <w:r>
+                        <w:t xml:space="preserve">    }</w:t>
+                      </w:r>
+                    </w:p>
+                    <w:p>
+                      <w:pPr>
+                        <w:spacing w:after="0"/>
+                      </w:pPr>
+                      <w:r>
+                        <w:t xml:space="preserve">  },</w:t>
+                      </w:r>
+                    </w:p>
+                    <w:p>
+                      <w:pPr>
+                        <w:spacing w:after="0"/>
+                      </w:pPr>
+                      <w:r>
+                        <w:t xml:space="preserve">  "message": "reflection created successfully",</w:t>
+                      </w:r>
+                    </w:p>
+                    <w:p>
+                      <w:pPr>
+                        <w:spacing w:after="0"/>
+                      </w:pPr>
+                      <w:r>
+                        <w:t xml:space="preserve">  "success": true</w:t>
                       </w:r>
                     </w:p>
                     <w:p>
@@ -34638,6 +33521,48 @@
         <w:spacing w:after="0"/>
         <w:rPr>
           <w:rFonts w:ascii="TH SarabunPSK" w:hAnsi="TH SarabunPSK" w:cs="TH SarabunPSK"/>
+          <w:sz w:val="36"/>
+          <w:szCs w:val="36"/>
+        </w:rPr>
+      </w:pPr>
+    </w:p>
+    <w:p>
+      <w:pPr>
+        <w:spacing w:after="0"/>
+        <w:rPr>
+          <w:rFonts w:ascii="TH SarabunPSK" w:hAnsi="TH SarabunPSK" w:cs="TH SarabunPSK"/>
+          <w:sz w:val="36"/>
+          <w:szCs w:val="36"/>
+        </w:rPr>
+      </w:pPr>
+    </w:p>
+    <w:p>
+      <w:pPr>
+        <w:spacing w:after="0"/>
+        <w:rPr>
+          <w:rFonts w:ascii="TH SarabunPSK" w:hAnsi="TH SarabunPSK" w:cs="TH SarabunPSK"/>
+          <w:sz w:val="36"/>
+          <w:szCs w:val="36"/>
+        </w:rPr>
+      </w:pPr>
+    </w:p>
+    <w:p>
+      <w:pPr>
+        <w:spacing w:after="0"/>
+        <w:rPr>
+          <w:rFonts w:ascii="TH SarabunPSK" w:hAnsi="TH SarabunPSK" w:cs="TH SarabunPSK"/>
+          <w:b/>
+          <w:bCs/>
+          <w:sz w:val="36"/>
+          <w:szCs w:val="36"/>
+        </w:rPr>
+      </w:pPr>
+    </w:p>
+    <w:p>
+      <w:pPr>
+        <w:spacing w:after="0"/>
+        <w:rPr>
+          <w:rFonts w:ascii="TH SarabunPSK" w:hAnsi="TH SarabunPSK" w:cs="TH SarabunPSK"/>
           <w:b/>
           <w:bCs/>
           <w:sz w:val="36"/>
@@ -34649,6 +33574,7 @@
     <w:p>
       <w:pPr>
         <w:spacing w:after="0"/>
+        <w:jc w:val="center"/>
         <w:rPr>
           <w:rFonts w:ascii="TH SarabunPSK" w:hAnsi="TH SarabunPSK" w:cs="TH SarabunPSK"/>
           <w:b/>
@@ -34657,10 +33583,7 @@
           <w:szCs w:val="36"/>
         </w:rPr>
       </w:pPr>
-    </w:p>
-    <w:p>
-      <w:pPr>
-        <w:spacing w:after="0"/>
+      <w:r>
         <w:rPr>
           <w:rFonts w:ascii="TH SarabunPSK" w:hAnsi="TH SarabunPSK" w:cs="TH SarabunPSK"/>
           <w:b/>
@@ -34668,708 +33591,7 @@
           <w:sz w:val="36"/>
           <w:szCs w:val="36"/>
         </w:rPr>
-      </w:pPr>
-    </w:p>
-    <w:p>
-      <w:pPr>
-        <w:spacing w:after="0"/>
-        <w:rPr>
-          <w:rFonts w:ascii="TH SarabunPSK" w:hAnsi="TH SarabunPSK" w:cs="TH SarabunPSK"/>
-          <w:b/>
-          <w:bCs/>
-          <w:sz w:val="36"/>
-          <w:szCs w:val="36"/>
-        </w:rPr>
-      </w:pPr>
-    </w:p>
-    <w:p>
-      <w:pPr>
-        <w:spacing w:after="0"/>
-        <w:rPr>
-          <w:rFonts w:ascii="TH SarabunPSK" w:hAnsi="TH SarabunPSK" w:cs="TH SarabunPSK"/>
-          <w:b/>
-          <w:bCs/>
-          <w:sz w:val="36"/>
-          <w:szCs w:val="36"/>
-        </w:rPr>
-      </w:pPr>
-    </w:p>
-    <w:p>
-      <w:pPr>
-        <w:spacing w:after="0"/>
-        <w:rPr>
-          <w:rFonts w:ascii="TH SarabunPSK" w:hAnsi="TH SarabunPSK" w:cs="TH SarabunPSK"/>
-          <w:b/>
-          <w:bCs/>
-          <w:sz w:val="32"/>
-          <w:szCs w:val="32"/>
-        </w:rPr>
-      </w:pPr>
-      <w:r>
-        <w:rPr>
-          <w:rFonts w:ascii="TH SarabunPSK" w:hAnsi="TH SarabunPSK" w:cs="TH SarabunPSK"/>
-          <w:b/>
-          <w:bCs/>
-          <w:sz w:val="32"/>
-          <w:szCs w:val="32"/>
-        </w:rPr>
-        <w:t>Delete Reflection</w:t>
-      </w:r>
-    </w:p>
-    <w:p>
-      <w:pPr>
-        <w:spacing w:after="0"/>
-        <w:rPr>
-          <w:rFonts w:ascii="TH SarabunPSK" w:hAnsi="TH SarabunPSK" w:cs="TH SarabunPSK"/>
-          <w:sz w:val="32"/>
-          <w:szCs w:val="32"/>
-        </w:rPr>
-      </w:pPr>
-      <w:proofErr w:type="gramStart"/>
-      <w:r>
-        <w:rPr>
-          <w:rFonts w:ascii="TH SarabunPSK" w:hAnsi="TH SarabunPSK" w:cs="TH SarabunPSK"/>
-          <w:b/>
-          <w:bCs/>
-          <w:sz w:val="32"/>
-          <w:szCs w:val="32"/>
-        </w:rPr>
         <w:lastRenderedPageBreak/>
-        <w:t>Port :</w:t>
-      </w:r>
-      <w:proofErr w:type="gramEnd"/>
-      <w:r>
-        <w:rPr>
-          <w:rFonts w:ascii="TH SarabunPSK" w:hAnsi="TH SarabunPSK" w:cs="TH SarabunPSK"/>
-          <w:b/>
-          <w:bCs/>
-          <w:sz w:val="32"/>
-          <w:szCs w:val="32"/>
-        </w:rPr>
-        <w:t xml:space="preserve"> </w:t>
-      </w:r>
-      <w:r>
-        <w:rPr>
-          <w:rFonts w:ascii="TH SarabunPSK" w:hAnsi="TH SarabunPSK" w:cs="TH SarabunPSK"/>
-          <w:b/>
-          <w:bCs/>
-          <w:sz w:val="32"/>
-          <w:szCs w:val="32"/>
-        </w:rPr>
-        <w:t>5</w:t>
-      </w:r>
-      <w:r>
-        <w:rPr>
-          <w:rFonts w:ascii="TH SarabunPSK" w:hAnsi="TH SarabunPSK" w:cs="TH SarabunPSK"/>
-          <w:b/>
-          <w:bCs/>
-          <w:sz w:val="32"/>
-          <w:szCs w:val="32"/>
-        </w:rPr>
-        <w:t>000</w:t>
-      </w:r>
-    </w:p>
-    <w:p>
-      <w:pPr>
-        <w:numPr>
-          <w:ilvl w:val="0"/>
-          <w:numId w:val="2"/>
-        </w:numPr>
-        <w:spacing w:after="0"/>
-        <w:rPr>
-          <w:rFonts w:ascii="TH SarabunPSK" w:hAnsi="TH SarabunPSK" w:cs="TH SarabunPSK"/>
-          <w:sz w:val="32"/>
-          <w:szCs w:val="32"/>
-        </w:rPr>
-      </w:pPr>
-      <w:r>
-        <w:rPr>
-          <w:rFonts w:ascii="TH SarabunPSK" w:hAnsi="TH SarabunPSK" w:cs="TH SarabunPSK"/>
-          <w:b/>
-          <w:bCs/>
-          <w:sz w:val="32"/>
-          <w:szCs w:val="32"/>
-        </w:rPr>
-        <w:t>URL:</w:t>
-      </w:r>
-      <w:r>
-        <w:rPr>
-          <w:rFonts w:ascii="TH SarabunPSK" w:hAnsi="TH SarabunPSK" w:cs="TH SarabunPSK"/>
-          <w:sz w:val="32"/>
-          <w:szCs w:val="32"/>
-        </w:rPr>
-        <w:t> </w:t>
-      </w:r>
-      <w:r>
-        <w:rPr>
-          <w:rFonts w:ascii="TH SarabunPSK" w:hAnsi="TH SarabunPSK" w:cs="TH SarabunPSK"/>
-          <w:sz w:val="32"/>
-          <w:szCs w:val="32"/>
-        </w:rPr>
-        <w:t>/</w:t>
-      </w:r>
-      <w:proofErr w:type="spellStart"/>
-      <w:r>
-        <w:rPr>
-          <w:rFonts w:ascii="TH SarabunPSK" w:hAnsi="TH SarabunPSK" w:cs="TH SarabunPSK"/>
-          <w:sz w:val="32"/>
-          <w:szCs w:val="32"/>
-        </w:rPr>
-        <w:t>api</w:t>
-      </w:r>
-      <w:proofErr w:type="spellEnd"/>
-      <w:r>
-        <w:rPr>
-          <w:rFonts w:ascii="TH SarabunPSK" w:hAnsi="TH SarabunPSK" w:cs="TH SarabunPSK"/>
-          <w:sz w:val="32"/>
-          <w:szCs w:val="32"/>
-        </w:rPr>
-        <w:t>/v1/</w:t>
-      </w:r>
-      <w:proofErr w:type="gramStart"/>
-      <w:r>
-        <w:rPr>
-          <w:rFonts w:ascii="TH SarabunPSK" w:hAnsi="TH SarabunPSK" w:cs="TH SarabunPSK"/>
-          <w:sz w:val="32"/>
-          <w:szCs w:val="32"/>
-        </w:rPr>
-        <w:t>reflections/{</w:t>
-      </w:r>
-      <w:proofErr w:type="spellStart"/>
-      <w:proofErr w:type="gramEnd"/>
-      <w:r>
-        <w:rPr>
-          <w:rFonts w:ascii="TH SarabunPSK" w:hAnsi="TH SarabunPSK" w:cs="TH SarabunPSK"/>
-          <w:sz w:val="32"/>
-          <w:szCs w:val="32"/>
-        </w:rPr>
-        <w:t>reflect_id</w:t>
-      </w:r>
-      <w:proofErr w:type="spellEnd"/>
-      <w:r>
-        <w:rPr>
-          <w:rFonts w:ascii="TH SarabunPSK" w:hAnsi="TH SarabunPSK" w:cs="TH SarabunPSK"/>
-          <w:sz w:val="32"/>
-          <w:szCs w:val="32"/>
-        </w:rPr>
-        <w:t>}</w:t>
-      </w:r>
-    </w:p>
-    <w:p>
-      <w:pPr>
-        <w:numPr>
-          <w:ilvl w:val="0"/>
-          <w:numId w:val="2"/>
-        </w:numPr>
-        <w:spacing w:after="0"/>
-        <w:rPr>
-          <w:rFonts w:ascii="TH SarabunPSK" w:hAnsi="TH SarabunPSK" w:cs="TH SarabunPSK"/>
-          <w:sz w:val="32"/>
-          <w:szCs w:val="32"/>
-        </w:rPr>
-      </w:pPr>
-      <w:r>
-        <w:rPr>
-          <w:rFonts w:ascii="TH SarabunPSK" w:hAnsi="TH SarabunPSK" w:cs="TH SarabunPSK"/>
-          <w:b/>
-          <w:bCs/>
-          <w:sz w:val="32"/>
-          <w:szCs w:val="32"/>
-        </w:rPr>
-        <w:t>Method</w:t>
-      </w:r>
-      <w:r>
-        <w:rPr>
-          <w:rFonts w:ascii="TH SarabunPSK" w:hAnsi="TH SarabunPSK" w:cs="TH SarabunPSK"/>
-          <w:sz w:val="32"/>
-          <w:szCs w:val="32"/>
-        </w:rPr>
-        <w:t xml:space="preserve">: </w:t>
-      </w:r>
-      <w:r>
-        <w:rPr>
-          <w:rFonts w:ascii="TH SarabunPSK" w:hAnsi="TH SarabunPSK" w:cs="TH SarabunPSK"/>
-          <w:sz w:val="32"/>
-          <w:szCs w:val="32"/>
-        </w:rPr>
-        <w:t>DELETE</w:t>
-      </w:r>
-    </w:p>
-    <w:p>
-      <w:pPr>
-        <w:numPr>
-          <w:ilvl w:val="0"/>
-          <w:numId w:val="2"/>
-        </w:numPr>
-        <w:spacing w:after="0"/>
-        <w:rPr>
-          <w:rFonts w:ascii="TH SarabunPSK" w:hAnsi="TH SarabunPSK" w:cs="TH SarabunPSK"/>
-          <w:sz w:val="32"/>
-          <w:szCs w:val="32"/>
-        </w:rPr>
-      </w:pPr>
-      <w:r>
-        <w:rPr>
-          <w:rFonts w:ascii="TH SarabunPSK" w:hAnsi="TH SarabunPSK" w:cs="TH SarabunPSK"/>
-          <w:b/>
-          <w:bCs/>
-          <w:sz w:val="32"/>
-          <w:szCs w:val="32"/>
-        </w:rPr>
-        <w:t xml:space="preserve">Description: </w:t>
-      </w:r>
-      <w:r>
-        <w:rPr>
-          <w:rFonts w:ascii="TH SarabunPSK" w:hAnsi="TH SarabunPSK" w:cs="TH SarabunPSK"/>
-          <w:sz w:val="32"/>
-          <w:szCs w:val="32"/>
-          <w:cs/>
-        </w:rPr>
-        <w:t>ลบบันทึกการเรียนรู้ที่ไม่ต้องการเก็บไว้ และข้อมูลที่ลบออกจะไม่สามารถกู้คืนได้เลย ผู้ใช้ต้องแน่ใจก่อนทำการลบ</w:t>
-      </w:r>
-    </w:p>
-    <w:p>
-      <w:pPr>
-        <w:numPr>
-          <w:ilvl w:val="0"/>
-          <w:numId w:val="2"/>
-        </w:numPr>
-        <w:spacing w:after="0"/>
-        <w:rPr>
-          <w:rFonts w:ascii="TH SarabunPSK" w:hAnsi="TH SarabunPSK" w:cs="TH SarabunPSK"/>
-          <w:sz w:val="32"/>
-          <w:szCs w:val="32"/>
-        </w:rPr>
-      </w:pPr>
-      <w:r>
-        <w:rPr>
-          <w:rFonts w:ascii="TH SarabunPSK" w:hAnsi="TH SarabunPSK" w:cs="TH SarabunPSK"/>
-          <w:b/>
-          <w:bCs/>
-          <w:sz w:val="32"/>
-          <w:szCs w:val="32"/>
-        </w:rPr>
-        <w:t xml:space="preserve">Response (200 OK): </w:t>
-      </w:r>
-    </w:p>
-    <w:p>
-      <w:pPr>
-        <w:pStyle w:val="ListParagraph"/>
-        <w:spacing w:after="0"/>
-        <w:rPr>
-          <w:rFonts w:ascii="TH SarabunPSK" w:hAnsi="TH SarabunPSK" w:cs="TH SarabunPSK"/>
-          <w:sz w:val="36"/>
-          <w:szCs w:val="36"/>
-        </w:rPr>
-      </w:pPr>
-      <w:r>
-        <w:rPr>
-          <w:noProof/>
-        </w:rPr>
-        <mc:AlternateContent>
-          <mc:Choice Requires="wps">
-            <w:drawing>
-              <wp:anchor distT="0" distB="0" distL="114300" distR="114300" simplePos="0" relativeHeight="251822080" behindDoc="0" locked="0" layoutInCell="1" allowOverlap="1" wp14:anchorId="1E1611ED" wp14:editId="4FBA7CD9">
-                <wp:simplePos x="0" y="0"/>
-                <wp:positionH relativeFrom="margin">
-                  <wp:align>right</wp:align>
-                </wp:positionH>
-                <wp:positionV relativeFrom="paragraph">
-                  <wp:posOffset>27940</wp:posOffset>
-                </wp:positionV>
-                <wp:extent cx="5925820" cy="1614115"/>
-                <wp:effectExtent l="0" t="0" r="17780" b="24765"/>
-                <wp:wrapNone/>
-                <wp:docPr id="1745380039" name="Rectangle 2"/>
-                <wp:cNvGraphicFramePr>
-                  <a:graphicFrameLocks xmlns:a="http://schemas.openxmlformats.org/drawingml/2006/main"/>
-                </wp:cNvGraphicFramePr>
-                <a:graphic xmlns:a="http://schemas.openxmlformats.org/drawingml/2006/main">
-                  <a:graphicData uri="http://schemas.microsoft.com/office/word/2010/wordprocessingShape">
-                    <wps:wsp>
-                      <wps:cNvSpPr>
-                        <a:spLocks noChangeArrowheads="1"/>
-                      </wps:cNvSpPr>
-                      <wps:spPr bwMode="auto">
-                        <a:xfrm>
-                          <a:off x="0" y="0"/>
-                          <a:ext cx="5925820" cy="1614115"/>
-                        </a:xfrm>
-                        <a:prstGeom prst="rect">
-                          <a:avLst/>
-                        </a:prstGeom>
-                        <a:solidFill>
-                          <a:schemeClr val="bg1">
-                            <a:lumMod val="85000"/>
-                            <a:lumOff val="0"/>
-                          </a:schemeClr>
-                        </a:solidFill>
-                        <a:ln w="9525">
-                          <a:solidFill>
-                            <a:srgbClr val="000000"/>
-                          </a:solidFill>
-                          <a:miter lim="800000"/>
-                          <a:headEnd/>
-                          <a:tailEnd/>
-                        </a:ln>
-                      </wps:spPr>
-                      <wps:bodyPr rot="0" vert="horz" wrap="square" lIns="91440" tIns="45720" rIns="91440" bIns="45720" anchor="t" anchorCtr="0" upright="1">
-                        <a:noAutofit/>
-                      </wps:bodyPr>
-                    </wps:wsp>
-                  </a:graphicData>
-                </a:graphic>
-                <wp14:sizeRelH relativeFrom="page">
-                  <wp14:pctWidth>0</wp14:pctWidth>
-                </wp14:sizeRelH>
-                <wp14:sizeRelV relativeFrom="page">
-                  <wp14:pctHeight>0</wp14:pctHeight>
-                </wp14:sizeRelV>
-              </wp:anchor>
-            </w:drawing>
-          </mc:Choice>
-          <mc:Fallback>
-            <w:pict>
-              <v:rect w14:anchorId="7662BE5B" id="Rectangle 2" o:spid="_x0000_s1026" style="position:absolute;margin-left:415.4pt;margin-top:2.2pt;width:466.6pt;height:127.1pt;z-index:251822080;visibility:visible;mso-wrap-style:square;mso-width-percent:0;mso-height-percent:0;mso-wrap-distance-left:9pt;mso-wrap-distance-top:0;mso-wrap-distance-right:9pt;mso-wrap-distance-bottom:0;mso-position-horizontal:right;mso-position-horizontal-relative:margin;mso-position-vertical:absolute;mso-position-vertical-relative:text;mso-width-percent:0;mso-height-percent:0;mso-width-relative:page;mso-height-relative:page;v-text-anchor:top" o:gfxdata="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" fillcolor="#d8d8d8 [2732]">
-                <w10:wrap anchorx="margin"/>
-              </v:rect>
-            </w:pict>
-          </mc:Fallback>
-        </mc:AlternateContent>
-      </w:r>
-      <w:r>
-        <w:rPr>
-          <w:noProof/>
-        </w:rPr>
-        <mc:AlternateContent>
-          <mc:Choice Requires="wps">
-            <w:drawing>
-              <wp:anchor distT="0" distB="0" distL="114300" distR="114300" simplePos="0" relativeHeight="251823104" behindDoc="0" locked="0" layoutInCell="1" allowOverlap="1" wp14:anchorId="4054832C" wp14:editId="05390FDF">
-                <wp:simplePos x="0" y="0"/>
-                <wp:positionH relativeFrom="column">
-                  <wp:posOffset>174929</wp:posOffset>
-                </wp:positionH>
-                <wp:positionV relativeFrom="paragraph">
-                  <wp:posOffset>137106</wp:posOffset>
-                </wp:positionV>
-                <wp:extent cx="5591810" cy="1463040"/>
-                <wp:effectExtent l="0" t="0" r="0" b="3810"/>
-                <wp:wrapNone/>
-                <wp:docPr id="1451874387" name="Text Box 3"/>
-                <wp:cNvGraphicFramePr>
-                  <a:graphicFrameLocks xmlns:a="http://schemas.openxmlformats.org/drawingml/2006/main"/>
-                </wp:cNvGraphicFramePr>
-                <a:graphic xmlns:a="http://schemas.openxmlformats.org/drawingml/2006/main">
-                  <a:graphicData uri="http://schemas.microsoft.com/office/word/2010/wordprocessingShape">
-                    <wps:wsp>
-                      <wps:cNvSpPr txBox="1">
-                        <a:spLocks noChangeArrowheads="1"/>
-                      </wps:cNvSpPr>
-                      <wps:spPr bwMode="auto">
-                        <a:xfrm>
-                          <a:off x="0" y="0"/>
-                          <a:ext cx="5591810" cy="1463040"/>
-                        </a:xfrm>
-                        <a:prstGeom prst="rect">
-                          <a:avLst/>
-                        </a:prstGeom>
-                        <a:noFill/>
-                        <a:ln>
-                          <a:noFill/>
-                        </a:ln>
-                        <a:extLst>
-                          <a:ext uri="{909E8E84-426E-40DD-AFC4-6F175D3DCCD1}">
-                            <a14:hiddenFill xmlns:a14="http://schemas.microsoft.com/office/drawing/2010/main">
-                              <a:solidFill>
-                                <a:srgbClr val="FFFFFF"/>
-                              </a:solidFill>
-                            </a14:hiddenFill>
-                          </a:ext>
-                          <a:ext uri="{91240B29-F687-4F45-9708-019B960494DF}">
-                            <a14:hiddenLine xmlns:a14="http://schemas.microsoft.com/office/drawing/2010/main" w="9525">
-                              <a:solidFill>
-                                <a:srgbClr val="000000"/>
-                              </a:solidFill>
-                              <a:miter lim="800000"/>
-                              <a:headEnd/>
-                              <a:tailEnd/>
-                            </a14:hiddenLine>
-                          </a:ext>
-                        </a:extLst>
-                      </wps:spPr>
-                      <wps:txbx>
-                        <w:txbxContent>
-                          <w:p>
-                            <w:pPr>
-                              <w:spacing w:after="0"/>
-                            </w:pPr>
-                            <w:r>
-                              <w:t>{</w:t>
-                            </w:r>
-                          </w:p>
-                          <w:p>
-                            <w:pPr>
-                              <w:spacing w:after="0"/>
-                            </w:pPr>
-                            <w:r>
-                              <w:t xml:space="preserve">  "success": true,</w:t>
-                            </w:r>
-                          </w:p>
-                          <w:p>
-                            <w:pPr>
-                              <w:spacing w:after="0"/>
-                            </w:pPr>
-                            <w:r>
-                              <w:t xml:space="preserve">  "message": "reflection deleted successfully",</w:t>
-                            </w:r>
-                          </w:p>
-                          <w:p>
-                            <w:pPr>
-                              <w:spacing w:after="0"/>
-                            </w:pPr>
-                            <w:r>
-                              <w:t xml:space="preserve">  "data": {</w:t>
-                            </w:r>
-                          </w:p>
-                          <w:p>
-                            <w:pPr>
-                              <w:spacing w:after="0"/>
-                            </w:pPr>
-                            <w:r>
-                              <w:t xml:space="preserve">    "</w:t>
-                            </w:r>
-                            <w:proofErr w:type="spellStart"/>
-                            <w:proofErr w:type="gramStart"/>
-                            <w:r>
-                              <w:t>reflect</w:t>
-                            </w:r>
-                            <w:proofErr w:type="gramEnd"/>
-                            <w:r>
-                              <w:t>_id</w:t>
-                            </w:r>
-                            <w:proofErr w:type="spellEnd"/>
-                            <w:r>
-                              <w:t>": "</w:t>
-                            </w:r>
-                            <w:proofErr w:type="spellStart"/>
-                            <w:r>
-                              <w:t>uuid</w:t>
-                            </w:r>
-                            <w:proofErr w:type="spellEnd"/>
-                            <w:r>
-                              <w:t>"</w:t>
-                            </w:r>
-                          </w:p>
-                          <w:p>
-                            <w:pPr>
-                              <w:spacing w:after="0"/>
-                            </w:pPr>
-                            <w:r>
-                              <w:t xml:space="preserve">  }</w:t>
-                            </w:r>
-                          </w:p>
-                          <w:p>
-                            <w:pPr>
-                              <w:spacing w:after="0"/>
-                            </w:pPr>
-                            <w:r>
-                              <w:t>}</w:t>
-                            </w:r>
-                          </w:p>
-                        </w:txbxContent>
-                      </wps:txbx>
-                      <wps:bodyPr rot="0" vert="horz" wrap="square" lIns="91440" tIns="45720" rIns="91440" bIns="45720" anchor="t" anchorCtr="0" upright="1">
-                        <a:noAutofit/>
-                      </wps:bodyPr>
-                    </wps:wsp>
-                  </a:graphicData>
-                </a:graphic>
-                <wp14:sizeRelH relativeFrom="page">
-                  <wp14:pctWidth>0</wp14:pctWidth>
-                </wp14:sizeRelH>
-                <wp14:sizeRelV relativeFrom="page">
-                  <wp14:pctHeight>0</wp14:pctHeight>
-                </wp14:sizeRelV>
-              </wp:anchor>
-            </w:drawing>
-          </mc:Choice>
-          <mc:Fallback>
-            <w:pict>
-              <v:shape w14:anchorId="4054832C" id="_x0000_s1071" type="#_x0000_t202" style="position:absolute;left:0;text-align:left;margin-left:13.75pt;margin-top:10.8pt;width:440.3pt;height:115.2pt;z-index:251823104;visibility:visible;mso-wrap-style:square;mso-width-percent:0;mso-height-percent:0;mso-wrap-distance-left:9pt;mso-wrap-distance-top:0;mso-wrap-distance-right:9pt;mso-wrap-distance-bottom:0;mso-position-horizontal:absolute;mso-position-horizontal-relative:text;mso-position-vertical:absolute;mso-position-vertical-relative:text;mso-width-percent:0;mso-height-percent:0;mso-width-relative:page;mso-height-relative:page;v-text-anchor:top" o:gfxdata="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" filled="f" stroked="f">
-                <v:textbox>
-                  <w:txbxContent>
-                    <w:p>
-                      <w:pPr>
-                        <w:spacing w:after="0"/>
-                      </w:pPr>
-                      <w:r>
-                        <w:t>{</w:t>
-                      </w:r>
-                    </w:p>
-                    <w:p>
-                      <w:pPr>
-                        <w:spacing w:after="0"/>
-                      </w:pPr>
-                      <w:r>
-                        <w:t xml:space="preserve">  "success": true,</w:t>
-                      </w:r>
-                    </w:p>
-                    <w:p>
-                      <w:pPr>
-                        <w:spacing w:after="0"/>
-                      </w:pPr>
-                      <w:r>
-                        <w:t xml:space="preserve">  "message": "reflection deleted successfully",</w:t>
-                      </w:r>
-                    </w:p>
-                    <w:p>
-                      <w:pPr>
-                        <w:spacing w:after="0"/>
-                      </w:pPr>
-                      <w:r>
-                        <w:t xml:space="preserve">  "data": {</w:t>
-                      </w:r>
-                    </w:p>
-                    <w:p>
-                      <w:pPr>
-                        <w:spacing w:after="0"/>
-                      </w:pPr>
-                      <w:r>
-                        <w:t xml:space="preserve">    "</w:t>
-                      </w:r>
-                      <w:proofErr w:type="spellStart"/>
-                      <w:proofErr w:type="gramStart"/>
-                      <w:r>
-                        <w:t>reflect</w:t>
-                      </w:r>
-                      <w:proofErr w:type="gramEnd"/>
-                      <w:r>
-                        <w:t>_id</w:t>
-                      </w:r>
-                      <w:proofErr w:type="spellEnd"/>
-                      <w:r>
-                        <w:t>": "</w:t>
-                      </w:r>
-                      <w:proofErr w:type="spellStart"/>
-                      <w:r>
-                        <w:t>uuid</w:t>
-                      </w:r>
-                      <w:proofErr w:type="spellEnd"/>
-                      <w:r>
-                        <w:t>"</w:t>
-                      </w:r>
-                    </w:p>
-                    <w:p>
-                      <w:pPr>
-                        <w:spacing w:after="0"/>
-                      </w:pPr>
-                      <w:r>
-                        <w:t xml:space="preserve">  }</w:t>
-                      </w:r>
-                    </w:p>
-                    <w:p>
-                      <w:pPr>
-                        <w:spacing w:after="0"/>
-                      </w:pPr>
-                      <w:r>
-                        <w:t>}</w:t>
-                      </w:r>
-                    </w:p>
-                  </w:txbxContent>
-                </v:textbox>
-              </v:shape>
-            </w:pict>
-          </mc:Fallback>
-        </mc:AlternateContent>
-      </w:r>
-    </w:p>
-    <w:p>
-      <w:pPr>
-        <w:spacing w:after="0"/>
-        <w:rPr>
-          <w:rFonts w:ascii="TH SarabunPSK" w:hAnsi="TH SarabunPSK" w:cs="TH SarabunPSK"/>
-          <w:sz w:val="36"/>
-          <w:szCs w:val="36"/>
-        </w:rPr>
-      </w:pPr>
-    </w:p>
-    <w:p>
-      <w:pPr>
-        <w:spacing w:after="0"/>
-        <w:ind w:left="360"/>
-        <w:rPr>
-          <w:rFonts w:ascii="TH SarabunPSK" w:hAnsi="TH SarabunPSK" w:cs="TH SarabunPSK"/>
-          <w:sz w:val="36"/>
-          <w:szCs w:val="36"/>
-        </w:rPr>
-      </w:pPr>
-    </w:p>
-    <w:p>
-      <w:pPr>
-        <w:spacing w:after="0"/>
-        <w:rPr>
-          <w:rFonts w:ascii="TH SarabunPSK" w:hAnsi="TH SarabunPSK" w:cs="TH SarabunPSK"/>
-          <w:sz w:val="32"/>
-          <w:szCs w:val="32"/>
-        </w:rPr>
-      </w:pPr>
-    </w:p>
-    <w:p>
-      <w:pPr>
-        <w:spacing w:after="0"/>
-        <w:rPr>
-          <w:rFonts w:ascii="TH SarabunPSK" w:hAnsi="TH SarabunPSK" w:cs="TH SarabunPSK"/>
-          <w:sz w:val="36"/>
-          <w:szCs w:val="36"/>
-        </w:rPr>
-      </w:pPr>
-    </w:p>
-    <w:p>
-      <w:pPr>
-        <w:spacing w:after="0"/>
-        <w:rPr>
-          <w:rFonts w:ascii="TH SarabunPSK" w:hAnsi="TH SarabunPSK" w:cs="TH SarabunPSK"/>
-          <w:b/>
-          <w:bCs/>
-          <w:sz w:val="36"/>
-          <w:szCs w:val="36"/>
-          <w:cs/>
-        </w:rPr>
-      </w:pPr>
-    </w:p>
-    <w:p>
-      <w:pPr>
-        <w:spacing w:after="0"/>
-        <w:rPr>
-          <w:rFonts w:ascii="TH SarabunPSK" w:hAnsi="TH SarabunPSK" w:cs="TH SarabunPSK"/>
-          <w:b/>
-          <w:bCs/>
-          <w:sz w:val="36"/>
-          <w:szCs w:val="36"/>
-          <w:cs/>
-        </w:rPr>
-      </w:pPr>
-    </w:p>
-    <w:p>
-      <w:pPr>
-        <w:spacing w:after="0"/>
-        <w:jc w:val="center"/>
-        <w:rPr>
-          <w:rFonts w:ascii="TH SarabunPSK" w:hAnsi="TH SarabunPSK" w:cs="TH SarabunPSK"/>
-          <w:b/>
-          <w:bCs/>
-          <w:sz w:val="36"/>
-          <w:szCs w:val="36"/>
-        </w:rPr>
-      </w:pPr>
-      <w:r>
-        <w:rPr>
-          <w:rFonts w:ascii="TH SarabunPSK" w:hAnsi="TH SarabunPSK" w:cs="TH SarabunPSK"/>
-          <w:b/>
-          <w:bCs/>
-          <w:sz w:val="36"/>
-          <w:szCs w:val="36"/>
-        </w:rPr>
         <w:t>Authentication Endpoint</w:t>
       </w:r>
     </w:p>
@@ -35953,7 +34175,7 @@
           </mc:Choice>
           <mc:Fallback>
             <w:pict>
-              <v:shape w14:anchorId="3D894AA3" id="_x0000_s1072" type="#_x0000_t202" style="position:absolute;left:0;text-align:left;margin-left:13.75pt;margin-top:10.65pt;width:440.3pt;height:138.35pt;z-index:251829248;visibility:visible;mso-wrap-style:square;mso-width-percent:0;mso-height-percent:0;mso-wrap-distance-left:9pt;mso-wrap-distance-top:0;mso-wrap-distance-right:9pt;mso-wrap-distance-bottom:0;mso-position-horizontal:absolute;mso-position-horizontal-relative:text;mso-position-vertical:absolute;mso-position-vertical-relative:text;mso-width-percent:0;mso-height-percent:0;mso-width-relative:page;mso-height-relative:page;v-text-anchor:top" o:gfxdata="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" filled="f" stroked="f">
+              <v:shape w14:anchorId="3D894AA3" id="_x0000_s1069" type="#_x0000_t202" style="position:absolute;left:0;text-align:left;margin-left:13.75pt;margin-top:10.65pt;width:440.3pt;height:138.35pt;z-index:251829248;visibility:visible;mso-wrap-style:square;mso-width-percent:0;mso-height-percent:0;mso-wrap-distance-left:9pt;mso-wrap-distance-top:0;mso-wrap-distance-right:9pt;mso-wrap-distance-bottom:0;mso-position-horizontal:absolute;mso-position-horizontal-relative:text;mso-position-vertical:absolute;mso-position-vertical-relative:text;mso-width-percent:0;mso-height-percent:0;mso-width-relative:page;mso-height-relative:page;v-text-anchor:top" o:gfxdata="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" filled="f" stroked="f">
                 <v:textbox>
                   <w:txbxContent>
                     <w:p>
@@ -36189,7 +34411,6 @@
         <w:rPr>
           <w:noProof/>
         </w:rPr>
-        <w:lastRenderedPageBreak/>
         <mc:AlternateContent>
           <mc:Choice Requires="wps">
             <w:drawing>
@@ -36411,7 +34632,7 @@
           </mc:Choice>
           <mc:Fallback>
             <w:pict>
-              <v:shape w14:anchorId="04374B6B" id="_x0000_s1073" type="#_x0000_t202" style="position:absolute;left:0;text-align:left;margin-left:13.75pt;margin-top:10.8pt;width:440.3pt;height:115.2pt;z-index:251826176;visibility:visible;mso-wrap-style:square;mso-width-percent:0;mso-height-percent:0;mso-wrap-distance-left:9pt;mso-wrap-distance-top:0;mso-wrap-distance-right:9pt;mso-wrap-distance-bottom:0;mso-position-horizontal:absolute;mso-position-horizontal-relative:text;mso-position-vertical:absolute;mso-position-vertical-relative:text;mso-width-percent:0;mso-height-percent:0;mso-width-relative:page;mso-height-relative:page;v-text-anchor:top" o:gfxdata="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" filled="f" stroked="f">
+              <v:shape w14:anchorId="04374B6B" id="_x0000_s1070" type="#_x0000_t202" style="position:absolute;left:0;text-align:left;margin-left:13.75pt;margin-top:10.8pt;width:440.3pt;height:115.2pt;z-index:251826176;visibility:visible;mso-wrap-style:square;mso-width-percent:0;mso-height-percent:0;mso-wrap-distance-left:9pt;mso-wrap-distance-top:0;mso-wrap-distance-right:9pt;mso-wrap-distance-bottom:0;mso-position-horizontal:absolute;mso-position-horizontal-relative:text;mso-position-vertical:absolute;mso-position-vertical-relative:text;mso-width-percent:0;mso-height-percent:0;mso-width-relative:page;mso-height-relative:page;v-text-anchor:top" o:gfxdata="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" filled="f" stroked="f">
                 <v:textbox>
                   <w:txbxContent>
                     <w:p>
@@ -36837,6 +35058,7 @@
         <w:rPr>
           <w:noProof/>
         </w:rPr>
+        <w:lastRenderedPageBreak/>
         <mc:AlternateContent>
           <mc:Choice Requires="wps">
             <w:drawing>
@@ -37029,7 +35251,7 @@
           </mc:Choice>
           <mc:Fallback>
             <w:pict>
-              <v:shape w14:anchorId="31C5E3EB" id="_x0000_s1074" type="#_x0000_t202" style="position:absolute;left:0;text-align:left;margin-left:13.75pt;margin-top:10.5pt;width:440.3pt;height:66.35pt;z-index:251834368;visibility:visible;mso-wrap-style:square;mso-width-percent:0;mso-height-percent:0;mso-wrap-distance-left:9pt;mso-wrap-distance-top:0;mso-wrap-distance-right:9pt;mso-wrap-distance-bottom:0;mso-position-horizontal:absolute;mso-position-horizontal-relative:text;mso-position-vertical:absolute;mso-position-vertical-relative:text;mso-width-percent:0;mso-height-percent:0;mso-width-relative:page;mso-height-relative:page;v-text-anchor:top" o:gfxdata="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" filled="f" stroked="f">
+              <v:shape w14:anchorId="31C5E3EB" id="_x0000_s1071" type="#_x0000_t202" style="position:absolute;left:0;text-align:left;margin-left:13.75pt;margin-top:10.5pt;width:440.3pt;height:66.35pt;z-index:251834368;visibility:visible;mso-wrap-style:square;mso-width-percent:0;mso-height-percent:0;mso-wrap-distance-left:9pt;mso-wrap-distance-top:0;mso-wrap-distance-right:9pt;mso-wrap-distance-bottom:0;mso-position-horizontal:absolute;mso-position-horizontal-relative:text;mso-position-vertical:absolute;mso-position-vertical-relative:text;mso-width-percent:0;mso-height-percent:0;mso-width-relative:page;mso-height-relative:page;v-text-anchor:top" o:gfxdata="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" filled="f" stroked="f">
                 <v:textbox>
                   <w:txbxContent>
                     <w:p>
@@ -37324,7 +35546,7 @@
           </mc:Choice>
           <mc:Fallback>
             <w:pict>
-              <v:shape w14:anchorId="33A383A8" id="_x0000_s1075" type="#_x0000_t202" style="position:absolute;left:0;text-align:left;margin-left:13.75pt;margin-top:10.5pt;width:440.3pt;height:66.35pt;z-index:251837440;visibility:visible;mso-wrap-style:square;mso-width-percent:0;mso-height-percent:0;mso-wrap-distance-left:9pt;mso-wrap-distance-top:0;mso-wrap-distance-right:9pt;mso-wrap-distance-bottom:0;mso-position-horizontal:absolute;mso-position-horizontal-relative:text;mso-position-vertical:absolute;mso-position-vertical-relative:text;mso-width-percent:0;mso-height-percent:0;mso-width-relative:page;mso-height-relative:page;v-text-anchor:top" o:gfxdata="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" filled="f" stroked="f">
+              <v:shape w14:anchorId="33A383A8" id="_x0000_s1072" type="#_x0000_t202" style="position:absolute;left:0;text-align:left;margin-left:13.75pt;margin-top:10.5pt;width:440.3pt;height:66.35pt;z-index:251837440;visibility:visible;mso-wrap-style:square;mso-width-percent:0;mso-height-percent:0;mso-wrap-distance-left:9pt;mso-wrap-distance-top:0;mso-wrap-distance-right:9pt;mso-wrap-distance-bottom:0;mso-position-horizontal:absolute;mso-position-horizontal-relative:text;mso-position-vertical:absolute;mso-position-vertical-relative:text;mso-width-percent:0;mso-height-percent:0;mso-width-relative:page;mso-height-relative:page;v-text-anchor:top" o:gfxdata="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" filled="f" stroked="f">
                 <v:textbox>
                   <w:txbxContent>
                     <w:p>
@@ -37700,7 +35922,7 @@
           </mc:Choice>
           <mc:Fallback>
             <w:pict>
-              <v:shape w14:anchorId="371A452C" id="_x0000_s1076" type="#_x0000_t202" style="position:absolute;left:0;text-align:left;margin-left:13.75pt;margin-top:10.95pt;width:440.3pt;height:130.85pt;z-index:251832320;visibility:visible;mso-wrap-style:square;mso-width-percent:0;mso-height-percent:0;mso-wrap-distance-left:9pt;mso-wrap-distance-top:0;mso-wrap-distance-right:9pt;mso-wrap-distance-bottom:0;mso-position-horizontal:absolute;mso-position-horizontal-relative:text;mso-position-vertical:absolute;mso-position-vertical-relative:text;mso-width-percent:0;mso-height-percent:0;mso-width-relative:page;mso-height-relative:page;v-text-anchor:top" o:gfxdata="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" filled="f" stroked="f">
+              <v:shape w14:anchorId="371A452C" id="_x0000_s1073" type="#_x0000_t202" style="position:absolute;left:0;text-align:left;margin-left:13.75pt;margin-top:10.95pt;width:440.3pt;height:130.85pt;z-index:251832320;visibility:visible;mso-wrap-style:square;mso-width-percent:0;mso-height-percent:0;mso-wrap-distance-left:9pt;mso-wrap-distance-top:0;mso-wrap-distance-right:9pt;mso-wrap-distance-bottom:0;mso-position-horizontal:absolute;mso-position-horizontal-relative:text;mso-position-vertical:absolute;mso-position-vertical-relative:text;mso-width-percent:0;mso-height-percent:0;mso-width-relative:page;mso-height-relative:page;v-text-anchor:top" o:gfxdata="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" filled="f" stroked="f">
                 <v:textbox>
                   <w:txbxContent>
                     <w:p>
@@ -37839,7 +36061,6 @@
           <w:sz w:val="32"/>
           <w:szCs w:val="32"/>
         </w:rPr>
-        <w:lastRenderedPageBreak/>
         <w:t>Port :</w:t>
       </w:r>
       <w:proofErr w:type="gramEnd"/>
@@ -38922,7 +37143,7 @@
           </mc:Choice>
           <mc:Fallback>
             <w:pict>
-              <v:shape w14:anchorId="097CB5EA" id="_x0000_s1077" type="#_x0000_t202" style="position:absolute;left:0;text-align:left;margin-left:13.75pt;margin-top:10.9pt;width:440.3pt;height:458.3pt;z-index:251843584;visibility:visible;mso-wrap-style:square;mso-width-percent:0;mso-height-percent:0;mso-wrap-distance-left:9pt;mso-wrap-distance-top:0;mso-wrap-distance-right:9pt;mso-wrap-distance-bottom:0;mso-position-horizontal:absolute;mso-position-horizontal-relative:text;mso-position-vertical:absolute;mso-position-vertical-relative:text;mso-width-percent:0;mso-height-percent:0;mso-width-relative:page;mso-height-relative:page;v-text-anchor:top" o:gfxdata="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" filled="f" stroked="f">
+              <v:shape w14:anchorId="097CB5EA" id="_x0000_s1074" type="#_x0000_t202" style="position:absolute;left:0;text-align:left;margin-left:13.75pt;margin-top:10.9pt;width:440.3pt;height:458.3pt;z-index:251843584;visibility:visible;mso-wrap-style:square;mso-width-percent:0;mso-height-percent:0;mso-wrap-distance-left:9pt;mso-wrap-distance-top:0;mso-wrap-distance-right:9pt;mso-wrap-distance-bottom:0;mso-position-horizontal:absolute;mso-position-horizontal-relative:text;mso-position-vertical:absolute;mso-position-vertical-relative:text;mso-width-percent:0;mso-height-percent:0;mso-width-relative:page;mso-height-relative:page;v-text-anchor:top" o:gfxdata="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" filled="f" stroked="f">
                 <v:textbox>
                   <w:txbxContent>
                     <w:p>
@@ -39667,7 +37888,6 @@
           <w:sz w:val="32"/>
           <w:szCs w:val="32"/>
         </w:rPr>
-        <w:lastRenderedPageBreak/>
         <w:t>Port :</w:t>
       </w:r>
       <w:proofErr w:type="gramEnd"/>
@@ -40370,7 +38590,7 @@
           </mc:Choice>
           <mc:Fallback>
             <w:pict>
-              <v:shape w14:anchorId="63E3E91D" id="_x0000_s1078" type="#_x0000_t202" style="position:absolute;left:0;text-align:left;margin-left:13.75pt;margin-top:10.45pt;width:440.3pt;height:97.05pt;z-index:251852800;visibility:visible;mso-wrap-style:square;mso-width-percent:0;mso-height-percent:0;mso-wrap-distance-left:9pt;mso-wrap-distance-top:0;mso-wrap-distance-right:9pt;mso-wrap-distance-bottom:0;mso-position-horizontal:absolute;mso-position-horizontal-relative:text;mso-position-vertical:absolute;mso-position-vertical-relative:text;mso-width-percent:0;mso-height-percent:0;mso-width-relative:page;mso-height-relative:page;v-text-anchor:top" o:gfxdata="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" filled="f" stroked="f">
+              <v:shape w14:anchorId="63E3E91D" id="_x0000_s1075" type="#_x0000_t202" style="position:absolute;left:0;text-align:left;margin-left:13.75pt;margin-top:10.45pt;width:440.3pt;height:97.05pt;z-index:251852800;visibility:visible;mso-wrap-style:square;mso-width-percent:0;mso-height-percent:0;mso-wrap-distance-left:9pt;mso-wrap-distance-top:0;mso-wrap-distance-right:9pt;mso-wrap-distance-bottom:0;mso-position-horizontal:absolute;mso-position-horizontal-relative:text;mso-position-vertical:absolute;mso-position-vertical-relative:text;mso-width-percent:0;mso-height-percent:0;mso-width-relative:page;mso-height-relative:page;v-text-anchor:top" o:gfxdata="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" filled="f" stroked="f">
                 <v:textbox>
                   <w:txbxContent>
                     <w:p>
@@ -40804,7 +39024,7 @@
           </mc:Choice>
           <mc:Fallback>
             <w:pict>
-              <v:shape w14:anchorId="0E2BB9EC" id="_x0000_s1079" type="#_x0000_t202" style="position:absolute;left:0;text-align:left;margin-left:13.75pt;margin-top:10.65pt;width:440.3pt;height:115.85pt;z-index:251846656;visibility:visible;mso-wrap-style:square;mso-width-percent:0;mso-height-percent:0;mso-wrap-distance-left:9pt;mso-wrap-distance-top:0;mso-wrap-distance-right:9pt;mso-wrap-distance-bottom:0;mso-position-horizontal:absolute;mso-position-horizontal-relative:text;mso-position-vertical:absolute;mso-position-vertical-relative:text;mso-width-percent:0;mso-height-percent:0;mso-width-relative:page;mso-height-relative:page;v-text-anchor:top" o:gfxdata="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" filled="f" stroked="f">
+              <v:shape w14:anchorId="0E2BB9EC" id="_x0000_s1076" type="#_x0000_t202" style="position:absolute;left:0;text-align:left;margin-left:13.75pt;margin-top:10.65pt;width:440.3pt;height:115.85pt;z-index:251846656;visibility:visible;mso-wrap-style:square;mso-width-percent:0;mso-height-percent:0;mso-wrap-distance-left:9pt;mso-wrap-distance-top:0;mso-wrap-distance-right:9pt;mso-wrap-distance-bottom:0;mso-position-horizontal:absolute;mso-position-horizontal-relative:text;mso-position-vertical:absolute;mso-position-vertical-relative:text;mso-width-percent:0;mso-height-percent:0;mso-width-relative:page;mso-height-relative:page;v-text-anchor:top" o:gfxdata="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" filled="f" stroked="f">
                 <v:textbox>
                   <w:txbxContent>
                     <w:p>
@@ -41070,7 +39290,6 @@
           <w:sz w:val="32"/>
           <w:szCs w:val="32"/>
         </w:rPr>
-        <w:lastRenderedPageBreak/>
         <w:t>Update User</w:t>
       </w:r>
     </w:p>
@@ -41741,7 +39960,7 @@
           </mc:Choice>
           <mc:Fallback>
             <w:pict>
-              <v:shape w14:anchorId="0AB86F0B" id="_x0000_s1080" type="#_x0000_t202" style="position:absolute;left:0;text-align:left;margin-left:13.75pt;margin-top:10.45pt;width:440.3pt;height:68.85pt;z-index:251857920;visibility:visible;mso-wrap-style:square;mso-width-percent:0;mso-height-percent:0;mso-wrap-distance-left:9pt;mso-wrap-distance-top:0;mso-wrap-distance-right:9pt;mso-wrap-distance-bottom:0;mso-position-horizontal:absolute;mso-position-horizontal-relative:text;mso-position-vertical:absolute;mso-position-vertical-relative:text;mso-width-percent:0;mso-height-percent:0;mso-width-relative:page;mso-height-relative:page;v-text-anchor:top" o:gfxdata="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" filled="f" stroked="f">
+              <v:shape w14:anchorId="0AB86F0B" id="_x0000_s1077" type="#_x0000_t202" style="position:absolute;left:0;text-align:left;margin-left:13.75pt;margin-top:10.45pt;width:440.3pt;height:68.85pt;z-index:251857920;visibility:visible;mso-wrap-style:square;mso-width-percent:0;mso-height-percent:0;mso-wrap-distance-left:9pt;mso-wrap-distance-top:0;mso-wrap-distance-right:9pt;mso-wrap-distance-bottom:0;mso-position-horizontal:absolute;mso-position-horizontal-relative:text;mso-position-vertical:absolute;mso-position-vertical-relative:text;mso-width-percent:0;mso-height-percent:0;mso-width-relative:page;mso-height-relative:page;v-text-anchor:top" o:gfxdata="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" filled="f" stroked="f">
                 <v:textbox>
                   <w:txbxContent>
                     <w:p>
@@ -42141,7 +40360,7 @@
           </mc:Choice>
           <mc:Fallback>
             <w:pict>
-              <v:shape w14:anchorId="20428DC8" id="_x0000_s1081" type="#_x0000_t202" style="position:absolute;left:0;text-align:left;margin-left:13.75pt;margin-top:10.65pt;width:440.3pt;height:115.85pt;z-index:251855872;visibility:visible;mso-wrap-style:square;mso-width-percent:0;mso-height-percent:0;mso-wrap-distance-left:9pt;mso-wrap-distance-top:0;mso-wrap-distance-right:9pt;mso-wrap-distance-bottom:0;mso-position-horizontal:absolute;mso-position-horizontal-relative:text;mso-position-vertical:absolute;mso-position-vertical-relative:text;mso-width-percent:0;mso-height-percent:0;mso-width-relative:page;mso-height-relative:page;v-text-anchor:top" o:gfxdata="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" filled="f" stroked="f">
+              <v:shape w14:anchorId="20428DC8" id="_x0000_s1078" type="#_x0000_t202" style="position:absolute;left:0;text-align:left;margin-left:13.75pt;margin-top:10.65pt;width:440.3pt;height:115.85pt;z-index:251855872;visibility:visible;mso-wrap-style:square;mso-width-percent:0;mso-height-percent:0;mso-wrap-distance-left:9pt;mso-wrap-distance-top:0;mso-wrap-distance-right:9pt;mso-wrap-distance-bottom:0;mso-position-horizontal:absolute;mso-position-horizontal-relative:text;mso-position-vertical:absolute;mso-position-vertical-relative:text;mso-width-percent:0;mso-height-percent:0;mso-width-relative:page;mso-height-relative:page;v-text-anchor:top" o:gfxdata="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" filled="f" stroked="f">
                 <v:textbox>
                   <w:txbxContent>
                     <w:p>
@@ -42394,7 +40613,6 @@
           <w:sz w:val="32"/>
           <w:szCs w:val="32"/>
         </w:rPr>
-        <w:lastRenderedPageBreak/>
         <w:t>Delete Account</w:t>
       </w:r>
     </w:p>
@@ -43023,7 +41241,7 @@
           </mc:Choice>
           <mc:Fallback>
             <w:pict>
-              <v:shape w14:anchorId="0453B879" id="_x0000_s1082" type="#_x0000_t202" style="position:absolute;left:0;text-align:left;margin-left:13.75pt;margin-top:10.45pt;width:440.3pt;height:51.95pt;z-index:251863040;visibility:visible;mso-wrap-style:square;mso-width-percent:0;mso-height-percent:0;mso-wrap-distance-left:9pt;mso-wrap-distance-top:0;mso-wrap-distance-right:9pt;mso-wrap-distance-bottom:0;mso-position-horizontal:absolute;mso-position-horizontal-relative:text;mso-position-vertical:absolute;mso-position-vertical-relative:text;mso-width-percent:0;mso-height-percent:0;mso-width-relative:page;mso-height-relative:page;v-text-anchor:top" o:gfxdata="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" filled="f" stroked="f">
+              <v:shape w14:anchorId="0453B879" id="_x0000_s1079" type="#_x0000_t202" style="position:absolute;left:0;text-align:left;margin-left:13.75pt;margin-top:10.45pt;width:440.3pt;height:51.95pt;z-index:251863040;visibility:visible;mso-wrap-style:square;mso-width-percent:0;mso-height-percent:0;mso-wrap-distance-left:9pt;mso-wrap-distance-top:0;mso-wrap-distance-right:9pt;mso-wrap-distance-bottom:0;mso-position-horizontal:absolute;mso-position-horizontal-relative:text;mso-position-vertical:absolute;mso-position-vertical-relative:text;mso-width-percent:0;mso-height-percent:0;mso-width-relative:page;mso-height-relative:page;v-text-anchor:top" o:gfxdata="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" filled="f" stroked="f">
                 <v:textbox>
                   <w:txbxContent>
                     <w:p>
@@ -43157,6 +41375,7 @@
         <w:rPr>
           <w:noProof/>
         </w:rPr>
+        <w:lastRenderedPageBreak/>
         <mc:AlternateContent>
           <mc:Choice Requires="wps">
             <w:drawing>
@@ -43378,7 +41597,7 @@
           </mc:Choice>
           <mc:Fallback>
             <w:pict>
-              <v:shape w14:anchorId="52689FA7" id="_x0000_s1083" type="#_x0000_t202" style="position:absolute;left:0;text-align:left;margin-left:13.75pt;margin-top:10.65pt;width:440.3pt;height:115.85pt;z-index:251860992;visibility:visible;mso-wrap-style:square;mso-width-percent:0;mso-height-percent:0;mso-wrap-distance-left:9pt;mso-wrap-distance-top:0;mso-wrap-distance-right:9pt;mso-wrap-distance-bottom:0;mso-position-horizontal:absolute;mso-position-horizontal-relative:text;mso-position-vertical:absolute;mso-position-vertical-relative:text;mso-width-percent:0;mso-height-percent:0;mso-width-relative:page;mso-height-relative:page;v-text-anchor:top" o:gfxdata="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" filled="f" stroked="f">
+              <v:shape w14:anchorId="52689FA7" id="_x0000_s1080" type="#_x0000_t202" style="position:absolute;left:0;text-align:left;margin-left:13.75pt;margin-top:10.65pt;width:440.3pt;height:115.85pt;z-index:251860992;visibility:visible;mso-wrap-style:square;mso-width-percent:0;mso-height-percent:0;mso-wrap-distance-left:9pt;mso-wrap-distance-top:0;mso-wrap-distance-right:9pt;mso-wrap-distance-bottom:0;mso-position-horizontal:absolute;mso-position-horizontal-relative:text;mso-position-vertical:absolute;mso-position-vertical-relative:text;mso-width-percent:0;mso-height-percent:0;mso-width-relative:page;mso-height-relative:page;v-text-anchor:top" o:gfxdata="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" filled="f" stroked="f">
                 <v:textbox>
                   <w:txbxContent>
                     <w:p>
@@ -43679,7 +41898,7 @@
       <w:pPr>
         <w:spacing w:after="0"/>
         <w:rPr>
-          <w:rFonts w:ascii="TH SarabunPSK" w:hAnsi="TH SarabunPSK" w:cs="TH SarabunPSK" w:hint="cs"/>
+          <w:rFonts w:ascii="TH SarabunPSK" w:hAnsi="TH SarabunPSK" w:cs="TH SarabunPSK"/>
           <w:b/>
           <w:bCs/>
           <w:sz w:val="36"/>

</xml_diff>